<commit_message>
Ran preliminary mediation using frequentist methods and created a DAG figure for the data anaylsis report. Started writting up the final pieces of the data analysis report with tabl1, boxplots, and DAG figure.
</commit_message>
<xml_diff>
--- a/Project1/Reports/Project1_Data_Analysis_Plan.docx
+++ b/Project1/Reports/Project1_Data_Analysis_Plan.docx
@@ -634,13 +634,311 @@
       <w:bookmarkEnd w:id="8"/>
       <w:bookmarkEnd w:id="9"/>
     </w:p>
+    <w:p/>
     <w:p>
       <w:pPr>
         <w:jc w:val="center"/>
       </w:pPr>
-    </w:p>
-    <w:p>
-      <w:pPr>
+      <w:r>
+        <w:lastRenderedPageBreak/>
+        <w:drawing>
+          <wp:inline distT="0" distB="0" distL="0" distR="0" wp14:anchorId="76D847AF" wp14:editId="1D6E3FB3">
+            <wp:extent cx="4907618" cy="7736619"/>
+            <wp:effectExtent l="0" t="0" r="0" b="0"/>
+            <wp:docPr id="514655323" name="Picture 1" descr="A screenshot of a table&#10;&#10;AI-generated content may be incorrect."/>
+            <wp:cNvGraphicFramePr>
+              <a:graphicFrameLocks xmlns:a="http://schemas.openxmlformats.org/drawingml/2006/main" noChangeAspect="1"/>
+            </wp:cNvGraphicFramePr>
+            <a:graphic xmlns:a="http://schemas.openxmlformats.org/drawingml/2006/main">
+              <a:graphicData uri="http://schemas.openxmlformats.org/drawingml/2006/picture">
+                <pic:pic xmlns:pic="http://schemas.openxmlformats.org/drawingml/2006/picture">
+                  <pic:nvPicPr>
+                    <pic:cNvPr id="514655323" name="Picture 1" descr="A screenshot of a table&#10;&#10;AI-generated content may be incorrect."/>
+                    <pic:cNvPicPr/>
+                  </pic:nvPicPr>
+                  <pic:blipFill>
+                    <a:blip r:embed="rId6"/>
+                    <a:stretch>
+                      <a:fillRect/>
+                    </a:stretch>
+                  </pic:blipFill>
+                  <pic:spPr>
+                    <a:xfrm>
+                      <a:off x="0" y="0"/>
+                      <a:ext cx="5028110" cy="7926569"/>
+                    </a:xfrm>
+                    <a:prstGeom prst="rect">
+                      <a:avLst/>
+                    </a:prstGeom>
+                  </pic:spPr>
+                </pic:pic>
+              </a:graphicData>
+            </a:graphic>
+          </wp:inline>
+        </w:drawing>
+      </w:r>
+    </w:p>
+    <w:p>
+      <w:pPr>
+        <w:pStyle w:val="Caption"/>
+        <w:rPr>
+          <w:sz w:val="21"/>
+          <w:szCs w:val="21"/>
+        </w:rPr>
+      </w:pPr>
+      <w:bookmarkStart w:id="10" w:name="_Ref220679477"/>
+      <w:r>
+        <w:rPr>
+          <w:b/>
+          <w:bCs/>
+          <w:sz w:val="21"/>
+          <w:szCs w:val="21"/>
+        </w:rPr>
+        <w:t xml:space="preserve">Table </w:t>
+      </w:r>
+      <w:r>
+        <w:rPr>
+          <w:b/>
+          <w:bCs/>
+          <w:sz w:val="21"/>
+          <w:szCs w:val="21"/>
+        </w:rPr>
+        <w:fldChar w:fldCharType="begin"/>
+      </w:r>
+      <w:r>
+        <w:rPr>
+          <w:b/>
+          <w:bCs/>
+          <w:sz w:val="21"/>
+          <w:szCs w:val="21"/>
+        </w:rPr>
+        <w:instrText xml:space="preserve"> SEQ Table \* ARABIC </w:instrText>
+      </w:r>
+      <w:r>
+        <w:rPr>
+          <w:b/>
+          <w:bCs/>
+          <w:sz w:val="21"/>
+          <w:szCs w:val="21"/>
+        </w:rPr>
+        <w:fldChar w:fldCharType="separate"/>
+      </w:r>
+      <w:r>
+        <w:rPr>
+          <w:b/>
+          <w:bCs/>
+          <w:noProof/>
+          <w:sz w:val="21"/>
+          <w:szCs w:val="21"/>
+        </w:rPr>
+        <w:t>1</w:t>
+      </w:r>
+      <w:r>
+        <w:rPr>
+          <w:b/>
+          <w:bCs/>
+          <w:sz w:val="21"/>
+          <w:szCs w:val="21"/>
+        </w:rPr>
+        <w:fldChar w:fldCharType="end"/>
+      </w:r>
+      <w:bookmarkEnd w:id="10"/>
+      <w:r>
+        <w:rPr>
+          <w:b/>
+          <w:bCs/>
+          <w:sz w:val="21"/>
+          <w:szCs w:val="21"/>
+        </w:rPr>
+        <w:t>.</w:t>
+      </w:r>
+      <w:r>
+        <w:rPr>
+          <w:sz w:val="21"/>
+          <w:szCs w:val="21"/>
+        </w:rPr>
+        <w:t> </w:t>
+      </w:r>
+      <w:r>
+        <w:rPr>
+          <w:sz w:val="21"/>
+          <w:szCs w:val="21"/>
+        </w:rPr>
+        <w:t>Baseline characteristics of HIV-infected men initiating HAART, overall and stratified by baseline hard drug use</w:t>
+      </w:r>
+      <w:r>
+        <w:rPr>
+          <w:sz w:val="21"/>
+          <w:szCs w:val="21"/>
+        </w:rPr>
+        <w:t>.</w:t>
+      </w:r>
+    </w:p>
+    <w:p>
+      <w:pPr>
+        <w:spacing w:after="0" w:line="240" w:lineRule="auto"/>
+      </w:pPr>
+      <w:r>
+        <w:lastRenderedPageBreak/>
+        <w:t xml:space="preserve">Baseline characteristics of the study cohort are presented in Table 1. At HAART initiation, </w:t>
+      </w:r>
+      <w:r>
+        <w:t>9.2</w:t>
+      </w:r>
+      <w:r>
+        <w:t xml:space="preserve">% of participants reported hard drug use. Drug users were </w:t>
+      </w:r>
+      <w:r>
+        <w:t>typically more depressed</w:t>
+      </w:r>
+      <w:r>
+        <w:t xml:space="preserve">, </w:t>
+      </w:r>
+      <w:r>
+        <w:t>had lower</w:t>
+      </w:r>
+      <w:r>
+        <w:t xml:space="preserve"> </w:t>
+      </w:r>
+      <w:r>
+        <w:t>baseline CD4 counts, and had comparable baseline viral load levels</w:t>
+      </w:r>
+      <w:r>
+        <w:t xml:space="preserve"> and QOL metrics</w:t>
+      </w:r>
+      <w:r>
+        <w:t xml:space="preserve"> relative to non-users.</w:t>
+      </w:r>
+    </w:p>
+    <w:p/>
+    <w:p>
+      <w:pPr>
+        <w:pStyle w:val="Caption"/>
+      </w:pPr>
+    </w:p>
+    <w:p>
+      <w:pPr>
+        <w:jc w:val="center"/>
+        <w:rPr>
+          <w:color w:val="000000" w:themeColor="text1"/>
+        </w:rPr>
+      </w:pPr>
+      <w:r>
+        <w:rPr>
+          <w:color w:val="000000" w:themeColor="text1"/>
+        </w:rPr>
+        <w:drawing>
+          <wp:inline distT="0" distB="0" distL="0" distR="0" wp14:anchorId="14125951" wp14:editId="3B96D431">
+            <wp:extent cx="4920609" cy="3371353"/>
+            <wp:effectExtent l="0" t="0" r="0" b="0"/>
+            <wp:docPr id="227822229" name="Picture 1" descr="A graph of different colored boxes&#10;&#10;AI-generated content may be incorrect."/>
+            <wp:cNvGraphicFramePr>
+              <a:graphicFrameLocks xmlns:a="http://schemas.openxmlformats.org/drawingml/2006/main" noChangeAspect="1"/>
+            </wp:cNvGraphicFramePr>
+            <a:graphic xmlns:a="http://schemas.openxmlformats.org/drawingml/2006/main">
+              <a:graphicData uri="http://schemas.openxmlformats.org/drawingml/2006/picture">
+                <pic:pic xmlns:pic="http://schemas.openxmlformats.org/drawingml/2006/picture">
+                  <pic:nvPicPr>
+                    <pic:cNvPr id="227822229" name="Picture 1" descr="A graph of different colored boxes&#10;&#10;AI-generated content may be incorrect."/>
+                    <pic:cNvPicPr/>
+                  </pic:nvPicPr>
+                  <pic:blipFill>
+                    <a:blip r:embed="rId7"/>
+                    <a:stretch>
+                      <a:fillRect/>
+                    </a:stretch>
+                  </pic:blipFill>
+                  <pic:spPr>
+                    <a:xfrm>
+                      <a:off x="0" y="0"/>
+                      <a:ext cx="4940246" cy="3384807"/>
+                    </a:xfrm>
+                    <a:prstGeom prst="rect">
+                      <a:avLst/>
+                    </a:prstGeom>
+                  </pic:spPr>
+                </pic:pic>
+              </a:graphicData>
+            </a:graphic>
+          </wp:inline>
+        </w:drawing>
+      </w:r>
+    </w:p>
+    <w:p>
+      <w:pPr>
+        <w:pStyle w:val="Caption"/>
+        <w:rPr>
+          <w:sz w:val="21"/>
+          <w:szCs w:val="21"/>
+        </w:rPr>
+      </w:pPr>
+      <w:r>
+        <w:rPr>
+          <w:b/>
+          <w:bCs/>
+          <w:sz w:val="21"/>
+          <w:szCs w:val="21"/>
+        </w:rPr>
+        <w:t xml:space="preserve">Figure </w:t>
+      </w:r>
+      <w:r>
+        <w:rPr>
+          <w:b/>
+          <w:bCs/>
+          <w:sz w:val="21"/>
+          <w:szCs w:val="21"/>
+        </w:rPr>
+        <w:t>1</w:t>
+      </w:r>
+      <w:r>
+        <w:rPr>
+          <w:sz w:val="21"/>
+          <w:szCs w:val="21"/>
+        </w:rPr>
+        <w:t xml:space="preserve">. Distribution of treatment response measures at baseline (Year 0) and Year 2 following HAART initiation, stratified by baseline hard drug use. Boxplots display the median and interquartile range, with points representing individual observations. </w:t>
+      </w:r>
+    </w:p>
+    <w:p>
+      <w:pPr>
+        <w:pStyle w:val="Caption"/>
+        <w:rPr>
+          <w:i w:val="0"/>
+          <w:iCs w:val="0"/>
+          <w:color w:val="auto"/>
+          <w:sz w:val="24"/>
+          <w:szCs w:val="24"/>
+        </w:rPr>
+      </w:pPr>
+      <w:r>
+        <w:rPr>
+          <w:i w:val="0"/>
+          <w:iCs w:val="0"/>
+          <w:color w:val="auto"/>
+          <w:sz w:val="24"/>
+          <w:szCs w:val="24"/>
+        </w:rPr>
+        <w:t>CD4+ T-cell counts increased from baseline to Year 2 in both groups. Viral load (log copies/mL) declined substantially following treatment initiation. Physical and mental quality-of-life scores remained relatively stable over time. Across outcomes, participants reporting hard drug use at baseline generally exhibited slightly lower CD4 counts and modestly higher viral load values compared to non-users at both time points.</w:t>
+      </w:r>
+    </w:p>
+    <w:p>
+      <w:pPr>
+        <w:rPr>
+          <w:color w:val="000000" w:themeColor="text1"/>
+        </w:rPr>
+      </w:pPr>
+    </w:p>
+    <w:p>
+      <w:pPr>
+        <w:pStyle w:val="Caption"/>
+        <w:rPr>
+          <w:sz w:val="21"/>
+          <w:szCs w:val="21"/>
+        </w:rPr>
+      </w:pPr>
+    </w:p>
+    <w:p>
+      <w:pPr>
+        <w:jc w:val="center"/>
         <w:rPr>
           <w:color w:val="000000" w:themeColor="text1"/>
         </w:rPr>
@@ -2339,6 +2637,24 @@
       <w:szCs w:val="20"/>
     </w:rPr>
   </w:style>
+  <w:style w:type="paragraph" w:customStyle="1" w:styleId="p1">
+    <w:name w:val="p1"/>
+    <w:basedOn w:val="Normal"/>
+    <w:rsid w:val="00525D92"/>
+    <w:pPr>
+      <w:spacing w:before="100" w:beforeAutospacing="1" w:after="100" w:afterAutospacing="1" w:line="240" w:lineRule="auto"/>
+    </w:pPr>
+    <w:rPr>
+      <w:rFonts w:ascii="Times New Roman" w:eastAsia="Times New Roman" w:hAnsi="Times New Roman" w:cs="Times New Roman"/>
+      <w:kern w:val="0"/>
+      <w14:ligatures w14:val="none"/>
+    </w:rPr>
+  </w:style>
+  <w:style w:type="character" w:customStyle="1" w:styleId="s1">
+    <w:name w:val="s1"/>
+    <w:basedOn w:val="DefaultParagraphFont"/>
+    <w:rsid w:val="00525D92"/>
+  </w:style>
 </w:styles>
 </file>
 

</xml_diff>

<commit_message>
first rough draft of data analysis plan is complete.
</commit_message>
<xml_diff>
--- a/Project1/Reports/Project1_Data_Analysis_Plan.docx
+++ b/Project1/Reports/Project1_Data_Analysis_Plan.docx
@@ -14,6 +14,7 @@
       </w:pPr>
       <w:bookmarkStart w:id="0" w:name="_Toc221895313"/>
       <w:bookmarkStart w:id="1" w:name="_Toc221895378"/>
+      <w:bookmarkStart w:id="2" w:name="_Toc222223983"/>
       <w:r>
         <w:rPr>
           <w:b/>
@@ -40,6 +41,7 @@
       </w:r>
       <w:bookmarkEnd w:id="0"/>
       <w:bookmarkEnd w:id="1"/>
+      <w:bookmarkEnd w:id="2"/>
     </w:p>
     <w:p>
       <w:pPr>
@@ -51,8 +53,9 @@
           <w:color w:val="000000" w:themeColor="text1"/>
         </w:rPr>
       </w:pPr>
-      <w:bookmarkStart w:id="2" w:name="_Toc221895314"/>
-      <w:bookmarkStart w:id="3" w:name="_Toc221895379"/>
+      <w:bookmarkStart w:id="3" w:name="_Toc221895314"/>
+      <w:bookmarkStart w:id="4" w:name="_Toc221895379"/>
+      <w:bookmarkStart w:id="5" w:name="_Toc222223984"/>
       <w:r>
         <w:rPr>
           <w:b/>
@@ -61,8 +64,9 @@
         </w:rPr>
         <w:t>Data Analysis Plan</w:t>
       </w:r>
-      <w:bookmarkEnd w:id="2"/>
       <w:bookmarkEnd w:id="3"/>
+      <w:bookmarkEnd w:id="4"/>
+      <w:bookmarkEnd w:id="5"/>
     </w:p>
     <w:p/>
     <w:p>
@@ -106,6 +110,358 @@
         <w:contextualSpacing/>
       </w:pPr>
     </w:p>
+    <w:sdt>
+      <w:sdtPr>
+        <w:id w:val="1857219255"/>
+        <w:docPartObj>
+          <w:docPartGallery w:val="Table of Contents"/>
+          <w:docPartUnique/>
+        </w:docPartObj>
+      </w:sdtPr>
+      <w:sdtEndPr>
+        <w:rPr>
+          <w:rFonts w:asciiTheme="minorHAnsi" w:eastAsiaTheme="minorHAnsi" w:hAnsiTheme="minorHAnsi" w:cstheme="minorBidi"/>
+          <w:noProof/>
+          <w:color w:val="auto"/>
+          <w:kern w:val="2"/>
+          <w:sz w:val="24"/>
+          <w:szCs w:val="24"/>
+          <w14:ligatures w14:val="standardContextual"/>
+        </w:rPr>
+      </w:sdtEndPr>
+      <w:sdtContent>
+        <w:p>
+          <w:pPr>
+            <w:pStyle w:val="TOCHeading"/>
+            <w:rPr>
+              <w:noProof/>
+            </w:rPr>
+          </w:pPr>
+          <w:r>
+            <w:t>Table of Contents</w:t>
+          </w:r>
+          <w:r>
+            <w:rPr>
+              <w:b w:val="0"/>
+              <w:bCs w:val="0"/>
+            </w:rPr>
+            <w:fldChar w:fldCharType="begin"/>
+          </w:r>
+          <w:r>
+            <w:instrText xml:space="preserve"> TOC \o "1-3" \h \z \u </w:instrText>
+          </w:r>
+          <w:r>
+            <w:rPr>
+              <w:b w:val="0"/>
+              <w:bCs w:val="0"/>
+            </w:rPr>
+            <w:fldChar w:fldCharType="separate"/>
+          </w:r>
+        </w:p>
+        <w:p>
+          <w:pPr>
+            <w:pStyle w:val="TOC2"/>
+            <w:tabs>
+              <w:tab w:val="right" w:leader="dot" w:pos="9350"/>
+            </w:tabs>
+            <w:rPr>
+              <w:rFonts w:eastAsiaTheme="minorEastAsia"/>
+              <w:b w:val="0"/>
+              <w:bCs w:val="0"/>
+              <w:noProof/>
+              <w:sz w:val="24"/>
+              <w:szCs w:val="24"/>
+            </w:rPr>
+          </w:pPr>
+          <w:hyperlink w:anchor="_Toc222223984" w:history="1">
+            <w:r>
+              <w:rPr>
+                <w:rStyle w:val="Hyperlink"/>
+                <w:noProof/>
+              </w:rPr>
+              <w:t>Data Analysis Plan</w:t>
+            </w:r>
+            <w:r>
+              <w:rPr>
+                <w:noProof/>
+                <w:webHidden/>
+              </w:rPr>
+              <w:tab/>
+            </w:r>
+            <w:r>
+              <w:rPr>
+                <w:noProof/>
+                <w:webHidden/>
+              </w:rPr>
+              <w:fldChar w:fldCharType="begin"/>
+            </w:r>
+            <w:r>
+              <w:rPr>
+                <w:noProof/>
+                <w:webHidden/>
+              </w:rPr>
+              <w:instrText xml:space="preserve"> PAGEREF _Toc222223984 \h </w:instrText>
+            </w:r>
+            <w:r>
+              <w:rPr>
+                <w:noProof/>
+                <w:webHidden/>
+              </w:rPr>
+            </w:r>
+            <w:r>
+              <w:rPr>
+                <w:noProof/>
+                <w:webHidden/>
+              </w:rPr>
+              <w:fldChar w:fldCharType="separate"/>
+            </w:r>
+            <w:r>
+              <w:rPr>
+                <w:noProof/>
+                <w:webHidden/>
+              </w:rPr>
+              <w:t>1</w:t>
+            </w:r>
+            <w:r>
+              <w:rPr>
+                <w:noProof/>
+                <w:webHidden/>
+              </w:rPr>
+              <w:fldChar w:fldCharType="end"/>
+            </w:r>
+          </w:hyperlink>
+        </w:p>
+        <w:p>
+          <w:pPr>
+            <w:pStyle w:val="TOC2"/>
+            <w:tabs>
+              <w:tab w:val="right" w:leader="dot" w:pos="9350"/>
+            </w:tabs>
+            <w:rPr>
+              <w:rFonts w:eastAsiaTheme="minorEastAsia"/>
+              <w:b w:val="0"/>
+              <w:bCs w:val="0"/>
+              <w:noProof/>
+              <w:sz w:val="24"/>
+              <w:szCs w:val="24"/>
+            </w:rPr>
+          </w:pPr>
+          <w:hyperlink w:anchor="_Toc222223985" w:history="1">
+            <w:r>
+              <w:rPr>
+                <w:rStyle w:val="Hyperlink"/>
+                <w:noProof/>
+              </w:rPr>
+              <w:t>1. Introduction</w:t>
+            </w:r>
+            <w:r>
+              <w:rPr>
+                <w:noProof/>
+                <w:webHidden/>
+              </w:rPr>
+              <w:tab/>
+            </w:r>
+            <w:r>
+              <w:rPr>
+                <w:noProof/>
+                <w:webHidden/>
+              </w:rPr>
+              <w:fldChar w:fldCharType="begin"/>
+            </w:r>
+            <w:r>
+              <w:rPr>
+                <w:noProof/>
+                <w:webHidden/>
+              </w:rPr>
+              <w:instrText xml:space="preserve"> PAGEREF _Toc222223985 \h </w:instrText>
+            </w:r>
+            <w:r>
+              <w:rPr>
+                <w:noProof/>
+                <w:webHidden/>
+              </w:rPr>
+            </w:r>
+            <w:r>
+              <w:rPr>
+                <w:noProof/>
+                <w:webHidden/>
+              </w:rPr>
+              <w:fldChar w:fldCharType="separate"/>
+            </w:r>
+            <w:r>
+              <w:rPr>
+                <w:noProof/>
+                <w:webHidden/>
+              </w:rPr>
+              <w:t>2</w:t>
+            </w:r>
+            <w:r>
+              <w:rPr>
+                <w:noProof/>
+                <w:webHidden/>
+              </w:rPr>
+              <w:fldChar w:fldCharType="end"/>
+            </w:r>
+          </w:hyperlink>
+        </w:p>
+        <w:p>
+          <w:pPr>
+            <w:pStyle w:val="TOC2"/>
+            <w:tabs>
+              <w:tab w:val="right" w:leader="dot" w:pos="9350"/>
+            </w:tabs>
+            <w:rPr>
+              <w:rFonts w:eastAsiaTheme="minorEastAsia"/>
+              <w:b w:val="0"/>
+              <w:bCs w:val="0"/>
+              <w:noProof/>
+              <w:sz w:val="24"/>
+              <w:szCs w:val="24"/>
+            </w:rPr>
+          </w:pPr>
+          <w:hyperlink w:anchor="_Toc222223986" w:history="1">
+            <w:r>
+              <w:rPr>
+                <w:rStyle w:val="Hyperlink"/>
+                <w:noProof/>
+              </w:rPr>
+              <w:t>2. Methods</w:t>
+            </w:r>
+            <w:r>
+              <w:rPr>
+                <w:noProof/>
+                <w:webHidden/>
+              </w:rPr>
+              <w:tab/>
+            </w:r>
+            <w:r>
+              <w:rPr>
+                <w:noProof/>
+                <w:webHidden/>
+              </w:rPr>
+              <w:fldChar w:fldCharType="begin"/>
+            </w:r>
+            <w:r>
+              <w:rPr>
+                <w:noProof/>
+                <w:webHidden/>
+              </w:rPr>
+              <w:instrText xml:space="preserve"> PAGEREF _Toc222223986 \h </w:instrText>
+            </w:r>
+            <w:r>
+              <w:rPr>
+                <w:noProof/>
+                <w:webHidden/>
+              </w:rPr>
+            </w:r>
+            <w:r>
+              <w:rPr>
+                <w:noProof/>
+                <w:webHidden/>
+              </w:rPr>
+              <w:fldChar w:fldCharType="separate"/>
+            </w:r>
+            <w:r>
+              <w:rPr>
+                <w:noProof/>
+                <w:webHidden/>
+              </w:rPr>
+              <w:t>2</w:t>
+            </w:r>
+            <w:r>
+              <w:rPr>
+                <w:noProof/>
+                <w:webHidden/>
+              </w:rPr>
+              <w:fldChar w:fldCharType="end"/>
+            </w:r>
+          </w:hyperlink>
+        </w:p>
+        <w:p>
+          <w:pPr>
+            <w:pStyle w:val="TOC2"/>
+            <w:tabs>
+              <w:tab w:val="right" w:leader="dot" w:pos="9350"/>
+            </w:tabs>
+            <w:rPr>
+              <w:rFonts w:eastAsiaTheme="minorEastAsia"/>
+              <w:b w:val="0"/>
+              <w:bCs w:val="0"/>
+              <w:noProof/>
+              <w:sz w:val="24"/>
+              <w:szCs w:val="24"/>
+            </w:rPr>
+          </w:pPr>
+          <w:hyperlink w:anchor="_Toc222223987" w:history="1">
+            <w:r>
+              <w:rPr>
+                <w:rStyle w:val="Hyperlink"/>
+                <w:noProof/>
+              </w:rPr>
+              <w:t>3. Preliminary Results</w:t>
+            </w:r>
+            <w:r>
+              <w:rPr>
+                <w:noProof/>
+                <w:webHidden/>
+              </w:rPr>
+              <w:tab/>
+            </w:r>
+            <w:r>
+              <w:rPr>
+                <w:noProof/>
+                <w:webHidden/>
+              </w:rPr>
+              <w:fldChar w:fldCharType="begin"/>
+            </w:r>
+            <w:r>
+              <w:rPr>
+                <w:noProof/>
+                <w:webHidden/>
+              </w:rPr>
+              <w:instrText xml:space="preserve"> PAGEREF _Toc222223987 \h </w:instrText>
+            </w:r>
+            <w:r>
+              <w:rPr>
+                <w:noProof/>
+                <w:webHidden/>
+              </w:rPr>
+            </w:r>
+            <w:r>
+              <w:rPr>
+                <w:noProof/>
+                <w:webHidden/>
+              </w:rPr>
+              <w:fldChar w:fldCharType="separate"/>
+            </w:r>
+            <w:r>
+              <w:rPr>
+                <w:noProof/>
+                <w:webHidden/>
+              </w:rPr>
+              <w:t>4</w:t>
+            </w:r>
+            <w:r>
+              <w:rPr>
+                <w:noProof/>
+                <w:webHidden/>
+              </w:rPr>
+              <w:fldChar w:fldCharType="end"/>
+            </w:r>
+          </w:hyperlink>
+        </w:p>
+        <w:p>
+          <w:r>
+            <w:rPr>
+              <w:b/>
+              <w:bCs/>
+              <w:noProof/>
+            </w:rPr>
+            <w:fldChar w:fldCharType="end"/>
+          </w:r>
+        </w:p>
+      </w:sdtContent>
+    </w:sdt>
     <w:p>
       <w:pPr>
         <w:pStyle w:val="Heading2"/>
@@ -157,40 +513,21 @@
       <w:pPr>
         <w:pStyle w:val="Heading2"/>
       </w:pPr>
-      <w:bookmarkStart w:id="4" w:name="_Toc221895315"/>
+      <w:bookmarkStart w:id="6" w:name="_Toc221895315"/>
     </w:p>
     <w:p/>
     <w:p>
       <w:pPr>
         <w:pStyle w:val="Heading2"/>
       </w:pPr>
-      <w:bookmarkStart w:id="5" w:name="_Toc221895380"/>
-    </w:p>
+      <w:bookmarkStart w:id="7" w:name="_Toc221895380"/>
+    </w:p>
+    <w:p/>
     <w:p>
       <w:pPr>
         <w:pStyle w:val="Heading2"/>
       </w:pPr>
-    </w:p>
-    <w:p>
-      <w:pPr>
-        <w:pStyle w:val="Heading2"/>
-      </w:pPr>
-    </w:p>
-    <w:p>
-      <w:pPr>
-        <w:pStyle w:val="Heading2"/>
-      </w:pPr>
-    </w:p>
-    <w:p>
-      <w:pPr>
-        <w:pStyle w:val="Heading2"/>
-      </w:pPr>
-    </w:p>
-    <w:p/>
-    <w:p>
-      <w:pPr>
-        <w:pStyle w:val="Heading2"/>
-      </w:pPr>
+      <w:bookmarkStart w:id="8" w:name="_Toc222223985"/>
       <w:r>
         <w:lastRenderedPageBreak/>
         <w:t>1. I</w:t>
@@ -198,121 +535,124 @@
       <w:r>
         <w:t>ntroduction</w:t>
       </w:r>
-      <w:bookmarkEnd w:id="4"/>
-      <w:bookmarkEnd w:id="5"/>
-    </w:p>
-    <w:p>
-      <w:r>
-        <w:t xml:space="preserve">This project is a secondary analysis of data from the Multicenter AIDS Cohort Study (MACS), an ongoing prospective cohort study of HIV-1 infection in homosexual and bisexual men in four major U.S. cities. The dataset contains up to 8 years of annual follow-up on </w:t>
-      </w:r>
-      <w:r>
-        <w:t xml:space="preserve">715 </w:t>
-      </w:r>
-      <w:r>
-        <w:t>HIV-infected men after initiating HAART (highly active antiretroviral therapy), including longitudinal laboratory measures, quality-of-life outcomes, and demographic</w:t>
-      </w:r>
-      <w:r>
-        <w:t xml:space="preserve"> and </w:t>
-      </w:r>
-      <w:r>
-        <w:t>health information.</w:t>
-      </w:r>
-    </w:p>
-    <w:p>
-      <w:r>
-        <w:t>The primary objective of this analysis is to determine whether treatment response two years after initiating HAART differs between men who reported using hard drugs</w:t>
-      </w:r>
-      <w:r>
-        <w:t xml:space="preserve"> </w:t>
-      </w:r>
-      <w:r>
-        <w:t>at baseline and those who did not report such use. Th</w:t>
-      </w:r>
-      <w:r>
-        <w:t>is question was biologically motivated by previous</w:t>
-      </w:r>
-      <w:r>
-        <w:t xml:space="preserve"> studies in vitro and in animal models </w:t>
-      </w:r>
-      <w:r>
-        <w:t xml:space="preserve">that </w:t>
-      </w:r>
-      <w:r>
-        <w:t xml:space="preserve">suggest hard drug use may suppress immune function and increase HIV replication. However, evidence from human studies has been inconsistent. </w:t>
-      </w:r>
-    </w:p>
-    <w:p>
-      <w:r>
-        <w:t xml:space="preserve">Treatment response in this study will be evaluated using four outcome measures assessed two years after HAART initiation. The first outcome is viral load defined as the number of HIV RNA copies per milliliter of blood. The second outcome is CD4+ T-cell count, a measure of immune function. Together, these laboratory measures provide objective indicators of </w:t>
-      </w:r>
-      <w:r>
-        <w:t>immunity</w:t>
-      </w:r>
-      <w:r>
-        <w:t xml:space="preserve"> suppression</w:t>
-      </w:r>
-      <w:r>
-        <w:t>.</w:t>
-      </w:r>
-    </w:p>
-    <w:p>
-      <w:r>
-        <w:t xml:space="preserve">In addition to laboratory outcomes, two quality-of-life </w:t>
-      </w:r>
-      <w:r>
-        <w:t xml:space="preserve">(QOL) </w:t>
-      </w:r>
-      <w:r>
-        <w:t>measures derived from the SF-36 instrument</w:t>
-      </w:r>
-      <w:r>
-        <w:t xml:space="preserve"> will be examined. T</w:t>
-      </w:r>
-      <w:r>
-        <w:t>he aggregate physical health score and the aggregate mental health score, each ranging from 0 to 100, with higher scores indicating better perceived health.</w:t>
-      </w:r>
-    </w:p>
-    <w:p>
-      <w:r>
-        <w:t xml:space="preserve">The </w:t>
-      </w:r>
-      <w:r>
-        <w:t xml:space="preserve">purpose of this preliminary report is to develop an analysis plan to answer the </w:t>
-      </w:r>
-      <w:r>
-        <w:t xml:space="preserve">specific hypothesis guiding this </w:t>
-      </w:r>
-      <w:r>
-        <w:t>analysis</w:t>
-      </w:r>
-      <w:r>
-        <w:t xml:space="preserve">, </w:t>
-      </w:r>
-      <w:r>
-        <w:t xml:space="preserve">that men who reported hard drug use at baseline will demonstrate a poorer treatment response at two years compared to non-users. Poorer response would be reflected by higher viral load, lower CD4+ T-cell count, and potentially lower physical and mental </w:t>
-      </w:r>
-      <w:r>
-        <w:t xml:space="preserve">QOL </w:t>
-      </w:r>
-      <w:r>
-        <w:t>scores.</w:t>
-      </w:r>
-    </w:p>
-    <w:p/>
-    <w:p>
-      <w:pPr>
-        <w:pStyle w:val="Heading2"/>
-      </w:pPr>
-      <w:bookmarkStart w:id="6" w:name="_Toc221895316"/>
-      <w:bookmarkStart w:id="7" w:name="_Toc221895381"/>
-      <w:r>
-        <w:t xml:space="preserve">2. </w:t>
-      </w:r>
-      <w:r>
-        <w:t>Methods</w:t>
-      </w:r>
       <w:bookmarkEnd w:id="6"/>
       <w:bookmarkEnd w:id="7"/>
+      <w:bookmarkEnd w:id="8"/>
+    </w:p>
+    <w:p>
+      <w:r>
+        <w:t xml:space="preserve">This project is a secondary analysis of data from the Multicenter AIDS Cohort Study (MACS), an ongoing prospective cohort study of HIV-1 infection in homosexual and bisexual men in four major U.S. cities. The dataset contains up to 8 years of annual follow-up on </w:t>
+      </w:r>
+      <w:r>
+        <w:t xml:space="preserve">715 </w:t>
+      </w:r>
+      <w:r>
+        <w:t>HIV-infected men after initiating HAART (highly active antiretroviral therapy), including longitudinal laboratory measures, quality-of-life outcomes, and demographic</w:t>
+      </w:r>
+      <w:r>
+        <w:t xml:space="preserve"> and </w:t>
+      </w:r>
+      <w:r>
+        <w:t>health information.</w:t>
+      </w:r>
+    </w:p>
+    <w:p>
+      <w:r>
+        <w:t>The primary objective of this analysis is to determine whether treatment response two years after initiating HAART differs between men who reported using hard drugs</w:t>
+      </w:r>
+      <w:r>
+        <w:t xml:space="preserve"> </w:t>
+      </w:r>
+      <w:r>
+        <w:t>at baseline and those who did not report such use. Th</w:t>
+      </w:r>
+      <w:r>
+        <w:t>is question was biologically motivated by previous</w:t>
+      </w:r>
+      <w:r>
+        <w:t xml:space="preserve"> studies in vitro and in animal models </w:t>
+      </w:r>
+      <w:r>
+        <w:t xml:space="preserve">that </w:t>
+      </w:r>
+      <w:r>
+        <w:t xml:space="preserve">suggest hard drug use may suppress immune function and increase HIV replication. However, evidence from human studies has been inconsistent. </w:t>
+      </w:r>
+    </w:p>
+    <w:p>
+      <w:r>
+        <w:t xml:space="preserve">Treatment response in this study will be evaluated using four outcome measures assessed two years after HAART initiation. The first outcome is viral load defined as the number of HIV RNA copies per milliliter of blood. The second outcome is CD4+ T-cell count, a measure of immune function. Together, these laboratory measures provide objective indicators of </w:t>
+      </w:r>
+      <w:r>
+        <w:t>immunity</w:t>
+      </w:r>
+      <w:r>
+        <w:t xml:space="preserve"> suppression</w:t>
+      </w:r>
+      <w:r>
+        <w:t>.</w:t>
+      </w:r>
+    </w:p>
+    <w:p>
+      <w:r>
+        <w:t xml:space="preserve">In addition to laboratory outcomes, two quality-of-life </w:t>
+      </w:r>
+      <w:r>
+        <w:t xml:space="preserve">(QOL) </w:t>
+      </w:r>
+      <w:r>
+        <w:t>measures derived from the SF-36 instrument</w:t>
+      </w:r>
+      <w:r>
+        <w:t xml:space="preserve"> will be examined. T</w:t>
+      </w:r>
+      <w:r>
+        <w:t>he aggregate physical health score and the aggregate mental health score, each ranging from 0 to 100, with higher scores indicating better perceived health.</w:t>
+      </w:r>
+    </w:p>
+    <w:p>
+      <w:r>
+        <w:t xml:space="preserve">The </w:t>
+      </w:r>
+      <w:r>
+        <w:t xml:space="preserve">purpose of this preliminary report is to develop an analysis plan to answer the </w:t>
+      </w:r>
+      <w:r>
+        <w:t xml:space="preserve">specific hypothesis guiding this </w:t>
+      </w:r>
+      <w:r>
+        <w:t>analysis</w:t>
+      </w:r>
+      <w:r>
+        <w:t xml:space="preserve">, </w:t>
+      </w:r>
+      <w:r>
+        <w:t xml:space="preserve">that men who reported hard drug use at baseline will demonstrate a poorer treatment response at two years compared to non-users. Poorer response would be reflected by higher viral load, lower CD4+ T-cell count, and potentially lower physical and mental </w:t>
+      </w:r>
+      <w:r>
+        <w:t xml:space="preserve">QOL </w:t>
+      </w:r>
+      <w:r>
+        <w:t>scores.</w:t>
+      </w:r>
+    </w:p>
+    <w:p/>
+    <w:p>
+      <w:pPr>
+        <w:pStyle w:val="Heading2"/>
+      </w:pPr>
+      <w:bookmarkStart w:id="9" w:name="_Toc221895316"/>
+      <w:bookmarkStart w:id="10" w:name="_Toc221895381"/>
+      <w:bookmarkStart w:id="11" w:name="_Toc222223986"/>
+      <w:r>
+        <w:t xml:space="preserve">2. </w:t>
+      </w:r>
+      <w:r>
+        <w:t>Methods</w:t>
+      </w:r>
+      <w:bookmarkEnd w:id="9"/>
+      <w:bookmarkEnd w:id="10"/>
+      <w:bookmarkEnd w:id="11"/>
     </w:p>
     <w:p>
       <w:pPr>
@@ -346,14 +686,9 @@
       <w:r>
         <w:t xml:space="preserve"> contained additional categories reflecting “trajectory-based” classifications and “insufficient data.” For the purposes of exploratory analyses, </w:t>
       </w:r>
-      <w:proofErr w:type="gramStart"/>
       <w:r>
         <w:lastRenderedPageBreak/>
-        <w:t>trajectory-based</w:t>
-      </w:r>
-      <w:proofErr w:type="gramEnd"/>
-      <w:r>
-        <w:t xml:space="preserve"> “Yes” and “No” categories were collapsed into single “Yes” and “No” levels, and observations coded as “insufficient data” were treated as missing</w:t>
+        <w:t>trajectory-based “Yes” and “No” categories were collapsed into single “Yes” and “No” levels, and observations coded as “insufficient data” were treated as missing</w:t>
       </w:r>
       <w:r>
         <w:t xml:space="preserve"> or NA values</w:t>
@@ -620,8 +955,9 @@
       <w:pPr>
         <w:pStyle w:val="Heading2"/>
       </w:pPr>
-      <w:bookmarkStart w:id="8" w:name="_Toc221895317"/>
-      <w:bookmarkStart w:id="9" w:name="_Toc221895382"/>
+      <w:bookmarkStart w:id="12" w:name="_Toc221895317"/>
+      <w:bookmarkStart w:id="13" w:name="_Toc221895382"/>
+      <w:bookmarkStart w:id="14" w:name="_Toc222223987"/>
       <w:r>
         <w:t xml:space="preserve">3. </w:t>
       </w:r>
@@ -631,8 +967,9 @@
       <w:r>
         <w:t>esults</w:t>
       </w:r>
-      <w:bookmarkEnd w:id="8"/>
-      <w:bookmarkEnd w:id="9"/>
+      <w:bookmarkEnd w:id="12"/>
+      <w:bookmarkEnd w:id="13"/>
+      <w:bookmarkEnd w:id="14"/>
     </w:p>
     <w:p/>
     <w:p>
@@ -686,7 +1023,7 @@
           <w:szCs w:val="21"/>
         </w:rPr>
       </w:pPr>
-      <w:bookmarkStart w:id="10" w:name="_Ref220679477"/>
+      <w:bookmarkStart w:id="15" w:name="_Ref220679477"/>
       <w:r>
         <w:rPr>
           <w:b/>
@@ -742,7 +1079,7 @@
         </w:rPr>
         <w:fldChar w:fldCharType="end"/>
       </w:r>
-      <w:bookmarkEnd w:id="10"/>
+      <w:bookmarkEnd w:id="15"/>
       <w:r>
         <w:rPr>
           <w:b/>
@@ -935,6 +1272,383 @@
           <w:szCs w:val="21"/>
         </w:rPr>
       </w:pPr>
+    </w:p>
+    <w:p>
+      <w:pPr>
+        <w:jc w:val="center"/>
+        <w:rPr>
+          <w:color w:val="000000" w:themeColor="text1"/>
+        </w:rPr>
+      </w:pPr>
+      <w:r>
+        <w:rPr>
+          <w:color w:val="000000" w:themeColor="text1"/>
+        </w:rPr>
+        <w:lastRenderedPageBreak/>
+        <w:drawing>
+          <wp:inline distT="0" distB="0" distL="0" distR="0" wp14:anchorId="262781E6" wp14:editId="643C5D8B">
+            <wp:extent cx="3578087" cy="2052843"/>
+            <wp:effectExtent l="0" t="0" r="3810" b="5080"/>
+            <wp:docPr id="1978726451" name="Picture 1" descr="A diagram of a triangle with numbers and formulas&#10;&#10;AI-generated content may be incorrect."/>
+            <wp:cNvGraphicFramePr>
+              <a:graphicFrameLocks xmlns:a="http://schemas.openxmlformats.org/drawingml/2006/main" noChangeAspect="1"/>
+            </wp:cNvGraphicFramePr>
+            <a:graphic xmlns:a="http://schemas.openxmlformats.org/drawingml/2006/main">
+              <a:graphicData uri="http://schemas.openxmlformats.org/drawingml/2006/picture">
+                <pic:pic xmlns:pic="http://schemas.openxmlformats.org/drawingml/2006/picture">
+                  <pic:nvPicPr>
+                    <pic:cNvPr id="1978726451" name="Picture 1" descr="A diagram of a triangle with numbers and formulas&#10;&#10;AI-generated content may be incorrect."/>
+                    <pic:cNvPicPr/>
+                  </pic:nvPicPr>
+                  <pic:blipFill>
+                    <a:blip r:embed="rId8"/>
+                    <a:stretch>
+                      <a:fillRect/>
+                    </a:stretch>
+                  </pic:blipFill>
+                  <pic:spPr>
+                    <a:xfrm>
+                      <a:off x="0" y="0"/>
+                      <a:ext cx="3605515" cy="2068579"/>
+                    </a:xfrm>
+                    <a:prstGeom prst="rect">
+                      <a:avLst/>
+                    </a:prstGeom>
+                  </pic:spPr>
+                </pic:pic>
+              </a:graphicData>
+            </a:graphic>
+          </wp:inline>
+        </w:drawing>
+      </w:r>
+    </w:p>
+    <w:p>
+      <w:pPr>
+        <w:pStyle w:val="Caption"/>
+        <w:rPr>
+          <w:sz w:val="21"/>
+          <w:szCs w:val="21"/>
+        </w:rPr>
+      </w:pPr>
+      <w:r>
+        <w:rPr>
+          <w:b/>
+          <w:bCs/>
+          <w:sz w:val="21"/>
+          <w:szCs w:val="21"/>
+        </w:rPr>
+        <w:t xml:space="preserve">Figure </w:t>
+      </w:r>
+      <w:r>
+        <w:rPr>
+          <w:b/>
+          <w:bCs/>
+          <w:sz w:val="21"/>
+          <w:szCs w:val="21"/>
+        </w:rPr>
+        <w:t>2</w:t>
+      </w:r>
+      <w:r>
+        <w:rPr>
+          <w:sz w:val="21"/>
+          <w:szCs w:val="21"/>
+        </w:rPr>
+        <w:t xml:space="preserve">. </w:t>
+      </w:r>
+      <w:r>
+        <w:rPr>
+          <w:sz w:val="21"/>
+          <w:szCs w:val="21"/>
+        </w:rPr>
+        <w:t>Conceptual h</w:t>
+      </w:r>
+      <w:r>
+        <w:rPr>
+          <w:sz w:val="21"/>
+          <w:szCs w:val="21"/>
+        </w:rPr>
+        <w:t>ypothesized mediation structure linking baseline hard drug use (X), adherence (M), and Year-2 CD4 count (Y)</w:t>
+      </w:r>
+      <w:r>
+        <w:rPr>
+          <w:sz w:val="21"/>
+          <w:szCs w:val="21"/>
+        </w:rPr>
+        <w:t xml:space="preserve"> outcome</w:t>
+      </w:r>
+      <w:r>
+        <w:rPr>
+          <w:sz w:val="21"/>
+          <w:szCs w:val="21"/>
+        </w:rPr>
+        <w:t>. Hard drug use may affect immune recovery directly and indirectly through its association with adherence. Covariates are not shown for simplicity.</w:t>
+      </w:r>
+    </w:p>
+    <w:p>
+      <w:pPr>
+        <w:pStyle w:val="Caption"/>
+        <w:rPr>
+          <w:i w:val="0"/>
+          <w:iCs w:val="0"/>
+          <w:sz w:val="21"/>
+          <w:szCs w:val="21"/>
+        </w:rPr>
+      </w:pPr>
+      <w:r>
+        <w:rPr>
+          <w:i w:val="0"/>
+          <w:iCs w:val="0"/>
+          <w:sz w:val="21"/>
+          <w:szCs w:val="21"/>
+        </w:rPr>
+        <w:t xml:space="preserve">Baseline hard drug use (X) is hypothesized to influence Year-2 CD4 count (Y) both directly and indirectly through adherence to HAART (M). The arrow from X to M represents the association between hard drug use and adherence, while the arrow from M to Y represents the association between adherence and </w:t>
+      </w:r>
+      <w:r>
+        <w:rPr>
+          <w:i w:val="0"/>
+          <w:iCs w:val="0"/>
+          <w:sz w:val="21"/>
+          <w:szCs w:val="21"/>
+        </w:rPr>
+        <w:t>CD4+ T cell counts</w:t>
+      </w:r>
+      <w:r>
+        <w:rPr>
+          <w:i w:val="0"/>
+          <w:iCs w:val="0"/>
+          <w:sz w:val="21"/>
+          <w:szCs w:val="21"/>
+        </w:rPr>
+        <w:t xml:space="preserve">. The direct path from X to Y </w:t>
+      </w:r>
+      <w:r>
+        <w:rPr>
+          <w:i w:val="0"/>
+          <w:iCs w:val="0"/>
+          <w:sz w:val="21"/>
+          <w:szCs w:val="21"/>
+        </w:rPr>
+        <w:t>reflects both the crude association between hard drug use and year-2 CD4 and the adjusted representation after accounting for adherence</w:t>
+      </w:r>
+      <w:r>
+        <w:rPr>
+          <w:i w:val="0"/>
+          <w:iCs w:val="0"/>
+          <w:sz w:val="21"/>
+          <w:szCs w:val="21"/>
+        </w:rPr>
+        <w:t>. Covariates are omitted from this preliminary diagram for clarity but are included in adjusted analyses.</w:t>
+      </w:r>
+      <w:r>
+        <w:rPr>
+          <w:i w:val="0"/>
+          <w:iCs w:val="0"/>
+          <w:sz w:val="21"/>
+          <w:szCs w:val="21"/>
+        </w:rPr>
+        <w:t xml:space="preserve"> Initial results, show that the percent being mediated by adherence is minimal</w:t>
+      </w:r>
+      <w:r>
+        <w:rPr>
+          <w:i w:val="0"/>
+          <w:iCs w:val="0"/>
+          <w:sz w:val="21"/>
+          <w:szCs w:val="21"/>
+        </w:rPr>
+        <w:t xml:space="preserve"> at approximately 4.4%</w:t>
+      </w:r>
+      <w:r>
+        <w:rPr>
+          <w:i w:val="0"/>
+          <w:iCs w:val="0"/>
+          <w:sz w:val="21"/>
+          <w:szCs w:val="21"/>
+        </w:rPr>
+        <w:t xml:space="preserve"> </w:t>
+      </w:r>
+      <w:r>
+        <w:rPr>
+          <w:i w:val="0"/>
+          <w:iCs w:val="0"/>
+          <w:sz w:val="21"/>
+          <w:szCs w:val="21"/>
+        </w:rPr>
+        <w:t>[</w:t>
+      </w:r>
+      <m:oMath>
+        <m:f>
+          <m:fPr>
+            <m:ctrlPr>
+              <w:rPr>
+                <w:rFonts w:ascii="Cambria Math" w:hAnsi="Cambria Math"/>
+                <w:iCs w:val="0"/>
+                <w:sz w:val="21"/>
+                <w:szCs w:val="21"/>
+              </w:rPr>
+            </m:ctrlPr>
+          </m:fPr>
+          <m:num>
+            <m:acc>
+              <m:accPr>
+                <m:ctrlPr>
+                  <w:rPr>
+                    <w:rFonts w:ascii="Cambria Math" w:hAnsi="Cambria Math"/>
+                    <w:iCs w:val="0"/>
+                    <w:sz w:val="21"/>
+                    <w:szCs w:val="21"/>
+                  </w:rPr>
+                </m:ctrlPr>
+              </m:accPr>
+              <m:e>
+                <m:sSub>
+                  <m:sSubPr>
+                    <m:ctrlPr>
+                      <w:rPr>
+                        <w:rFonts w:ascii="Cambria Math" w:hAnsi="Cambria Math"/>
+                        <w:iCs w:val="0"/>
+                        <w:sz w:val="21"/>
+                        <w:szCs w:val="21"/>
+                      </w:rPr>
+                    </m:ctrlPr>
+                  </m:sSubPr>
+                  <m:e>
+                    <m:r>
+                      <w:rPr>
+                        <w:rFonts w:ascii="Cambria Math" w:hAnsi="Cambria Math"/>
+                        <w:sz w:val="21"/>
+                        <w:szCs w:val="21"/>
+                      </w:rPr>
+                      <m:t>β</m:t>
+                    </m:r>
+                  </m:e>
+                  <m:sub>
+                    <m:r>
+                      <w:rPr>
+                        <w:rFonts w:ascii="Cambria Math" w:hAnsi="Cambria Math"/>
+                        <w:sz w:val="21"/>
+                        <w:szCs w:val="21"/>
+                      </w:rPr>
+                      <m:t>crude</m:t>
+                    </m:r>
+                  </m:sub>
+                </m:sSub>
+              </m:e>
+            </m:acc>
+            <m:r>
+              <w:rPr>
+                <w:rFonts w:ascii="Cambria Math" w:hAnsi="Cambria Math"/>
+                <w:sz w:val="21"/>
+                <w:szCs w:val="21"/>
+              </w:rPr>
+              <m:t xml:space="preserve">- </m:t>
+            </m:r>
+            <m:acc>
+              <m:accPr>
+                <m:ctrlPr>
+                  <w:rPr>
+                    <w:rFonts w:ascii="Cambria Math" w:hAnsi="Cambria Math"/>
+                    <w:iCs w:val="0"/>
+                    <w:sz w:val="21"/>
+                    <w:szCs w:val="21"/>
+                  </w:rPr>
+                </m:ctrlPr>
+              </m:accPr>
+              <m:e>
+                <m:sSub>
+                  <m:sSubPr>
+                    <m:ctrlPr>
+                      <w:rPr>
+                        <w:rFonts w:ascii="Cambria Math" w:hAnsi="Cambria Math"/>
+                        <w:iCs w:val="0"/>
+                        <w:sz w:val="21"/>
+                        <w:szCs w:val="21"/>
+                      </w:rPr>
+                    </m:ctrlPr>
+                  </m:sSubPr>
+                  <m:e>
+                    <m:r>
+                      <w:rPr>
+                        <w:rFonts w:ascii="Cambria Math" w:hAnsi="Cambria Math"/>
+                        <w:sz w:val="21"/>
+                        <w:szCs w:val="21"/>
+                      </w:rPr>
+                      <m:t>β</m:t>
+                    </m:r>
+                  </m:e>
+                  <m:sub>
+                    <m:r>
+                      <w:rPr>
+                        <w:rFonts w:ascii="Cambria Math" w:hAnsi="Cambria Math"/>
+                        <w:sz w:val="21"/>
+                        <w:szCs w:val="21"/>
+                      </w:rPr>
+                      <m:t>adj</m:t>
+                    </m:r>
+                  </m:sub>
+                </m:sSub>
+              </m:e>
+            </m:acc>
+          </m:num>
+          <m:den>
+            <m:acc>
+              <m:accPr>
+                <m:ctrlPr>
+                  <w:rPr>
+                    <w:rFonts w:ascii="Cambria Math" w:hAnsi="Cambria Math"/>
+                    <w:iCs w:val="0"/>
+                    <w:sz w:val="21"/>
+                    <w:szCs w:val="21"/>
+                  </w:rPr>
+                </m:ctrlPr>
+              </m:accPr>
+              <m:e>
+                <m:sSub>
+                  <m:sSubPr>
+                    <m:ctrlPr>
+                      <w:rPr>
+                        <w:rFonts w:ascii="Cambria Math" w:hAnsi="Cambria Math"/>
+                        <w:iCs w:val="0"/>
+                        <w:sz w:val="21"/>
+                        <w:szCs w:val="21"/>
+                      </w:rPr>
+                    </m:ctrlPr>
+                  </m:sSubPr>
+                  <m:e>
+                    <m:r>
+                      <w:rPr>
+                        <w:rFonts w:ascii="Cambria Math" w:hAnsi="Cambria Math"/>
+                        <w:sz w:val="21"/>
+                        <w:szCs w:val="21"/>
+                      </w:rPr>
+                      <m:t>β</m:t>
+                    </m:r>
+                  </m:e>
+                  <m:sub>
+                    <m:r>
+                      <w:rPr>
+                        <w:rFonts w:ascii="Cambria Math" w:hAnsi="Cambria Math"/>
+                        <w:sz w:val="21"/>
+                        <w:szCs w:val="21"/>
+                      </w:rPr>
+                      <m:t>crude</m:t>
+                    </m:r>
+                  </m:sub>
+                </m:sSub>
+              </m:e>
+            </m:acc>
+          </m:den>
+        </m:f>
+      </m:oMath>
+      <w:r>
+        <w:rPr>
+          <w:rFonts w:eastAsiaTheme="minorEastAsia"/>
+          <w:i w:val="0"/>
+          <w:iCs w:val="0"/>
+          <w:sz w:val="21"/>
+          <w:szCs w:val="21"/>
+        </w:rPr>
+        <w:t>].</w:t>
+      </w:r>
     </w:p>
     <w:p>
       <w:pPr>

</xml_diff>

<commit_message>
Finished writing up data analysis plan and created a pdf file of the report.
</commit_message>
<xml_diff>
--- a/Project1/Reports/Project1_Data_Analysis_Plan.docx
+++ b/Project1/Reports/Project1_Data_Analysis_Plan.docx
@@ -686,9 +686,14 @@
       <w:r>
         <w:t xml:space="preserve"> contained additional categories reflecting “trajectory-based” classifications and “insufficient data.” For the purposes of exploratory analyses, </w:t>
       </w:r>
+      <w:proofErr w:type="gramStart"/>
       <w:r>
         <w:lastRenderedPageBreak/>
-        <w:t>trajectory-based “Yes” and “No” categories were collapsed into single “Yes” and “No” levels, and observations coded as “insufficient data” were treated as missing</w:t>
+        <w:t>trajectory-based</w:t>
+      </w:r>
+      <w:proofErr w:type="gramEnd"/>
+      <w:r>
+        <w:t xml:space="preserve"> “Yes” and “No” categories were collapsed into single “Yes” and “No” levels, and observations coded as “insufficient data” were treated as missing</w:t>
       </w:r>
       <w:r>
         <w:t xml:space="preserve"> or NA values</w:t>
@@ -935,6 +940,41 @@
     </w:p>
     <w:p>
       <w:r>
+        <w:t xml:space="preserve">To assess the potential impact of loss to follow-up, baseline characteristics will be compared between participants with complete baseline and Year 2 measurements and those without Year 2 data. Differences in continuous variables will be evaluated using </w:t>
+      </w:r>
+      <w:r>
+        <w:t>Welch’s</w:t>
+      </w:r>
+      <w:r>
+        <w:t xml:space="preserve"> t-test</w:t>
+      </w:r>
+      <w:r>
+        <w:t xml:space="preserve"> or Wilcoxon rank sum test</w:t>
+      </w:r>
+      <w:r>
+        <w:t xml:space="preserve">, and differences in categorical variables will be assessed using </w:t>
+      </w:r>
+      <w:r>
+        <w:t xml:space="preserve">Pearson’s </w:t>
+      </w:r>
+      <w:r>
+        <w:t>chi-square tests</w:t>
+      </w:r>
+      <w:r>
+        <w:t xml:space="preserve"> or Fisher’s exact tests</w:t>
+      </w:r>
+      <w:r>
+        <w:t xml:space="preserve">. Findings will be interpreted under the assumption that missingness is at least missing at </w:t>
+      </w:r>
+      <w:r>
+        <w:t>random (MAR), where dropout depends on observed variables</w:t>
+      </w:r>
+      <w:r>
+        <w:t>.</w:t>
+      </w:r>
+    </w:p>
+    <w:p>
+      <w:r>
         <w:t xml:space="preserve">All regression analyses </w:t>
       </w:r>
       <w:r>
@@ -950,6 +990,7 @@
         <w:t xml:space="preserve"> reported alongside model results.</w:t>
       </w:r>
     </w:p>
+    <w:p/>
     <w:p/>
     <w:p>
       <w:pPr>
@@ -959,6 +1000,7 @@
       <w:bookmarkStart w:id="13" w:name="_Toc221895382"/>
       <w:bookmarkStart w:id="14" w:name="_Toc222223987"/>
       <w:r>
+        <w:lastRenderedPageBreak/>
         <w:t xml:space="preserve">3. </w:t>
       </w:r>
       <w:r>
@@ -971,16 +1013,14 @@
       <w:bookmarkEnd w:id="13"/>
       <w:bookmarkEnd w:id="14"/>
     </w:p>
-    <w:p/>
     <w:p>
       <w:pPr>
         <w:jc w:val="center"/>
       </w:pPr>
       <w:r>
-        <w:lastRenderedPageBreak/>
         <w:drawing>
-          <wp:inline distT="0" distB="0" distL="0" distR="0" wp14:anchorId="76D847AF" wp14:editId="1D6E3FB3">
-            <wp:extent cx="4907618" cy="7736619"/>
+          <wp:inline distT="0" distB="0" distL="0" distR="0" wp14:anchorId="76D847AF" wp14:editId="1B596245">
+            <wp:extent cx="4675603" cy="7370859"/>
             <wp:effectExtent l="0" t="0" r="0" b="0"/>
             <wp:docPr id="514655323" name="Picture 1" descr="A screenshot of a table&#10;&#10;AI-generated content may be incorrect."/>
             <wp:cNvGraphicFramePr>
@@ -1002,7 +1042,7 @@
                   <pic:spPr>
                     <a:xfrm>
                       <a:off x="0" y="0"/>
-                      <a:ext cx="5028110" cy="7926569"/>
+                      <a:ext cx="4872693" cy="7681562"/>
                     </a:xfrm>
                     <a:prstGeom prst="rect">
                       <a:avLst/>
@@ -1147,7 +1187,6 @@
         <w:t xml:space="preserve"> relative to non-users.</w:t>
       </w:r>
     </w:p>
-    <w:p/>
     <w:p>
       <w:pPr>
         <w:pStyle w:val="Caption"/>
@@ -1254,7 +1293,137 @@
           <w:sz w:val="24"/>
           <w:szCs w:val="24"/>
         </w:rPr>
-        <w:t>CD4+ T-cell counts increased from baseline to Year 2 in both groups. Viral load (log copies/mL) declined substantially following treatment initiation. Physical and mental quality-of-life scores remained relatively stable over time. Across outcomes, participants reporting hard drug use at baseline generally exhibited slightly lower CD4 counts and modestly higher viral load values compared to non-users at both time points.</w:t>
+        <w:t xml:space="preserve">CD4+ T-cell counts increased from baseline to Year 2 in both groups. </w:t>
+      </w:r>
+      <w:r>
+        <w:rPr>
+          <w:i w:val="0"/>
+          <w:iCs w:val="0"/>
+          <w:color w:val="auto"/>
+          <w:sz w:val="24"/>
+          <w:szCs w:val="24"/>
+        </w:rPr>
+        <w:t xml:space="preserve">Participants </w:t>
+      </w:r>
+      <w:r>
+        <w:rPr>
+          <w:i w:val="0"/>
+          <w:iCs w:val="0"/>
+          <w:color w:val="auto"/>
+          <w:sz w:val="24"/>
+          <w:szCs w:val="24"/>
+        </w:rPr>
+        <w:t>reporting hard drug use at baseline generally exhibited slightly lower CD4 counts at both time points</w:t>
+      </w:r>
+      <w:r>
+        <w:rPr>
+          <w:i w:val="0"/>
+          <w:iCs w:val="0"/>
+          <w:color w:val="auto"/>
+          <w:sz w:val="24"/>
+          <w:szCs w:val="24"/>
+        </w:rPr>
+        <w:t xml:space="preserve"> but with more variability at year 2</w:t>
+      </w:r>
+      <w:r>
+        <w:rPr>
+          <w:i w:val="0"/>
+          <w:iCs w:val="0"/>
+          <w:color w:val="auto"/>
+          <w:sz w:val="24"/>
+          <w:szCs w:val="24"/>
+        </w:rPr>
+        <w:t xml:space="preserve">. </w:t>
+      </w:r>
+      <w:r>
+        <w:rPr>
+          <w:i w:val="0"/>
+          <w:iCs w:val="0"/>
+          <w:color w:val="auto"/>
+          <w:sz w:val="24"/>
+          <w:szCs w:val="24"/>
+        </w:rPr>
+        <w:t>Viral load (log copies/mL) declined substantially following treatment initiation</w:t>
+      </w:r>
+      <w:r>
+        <w:rPr>
+          <w:i w:val="0"/>
+          <w:iCs w:val="0"/>
+          <w:color w:val="auto"/>
+          <w:sz w:val="24"/>
+          <w:szCs w:val="24"/>
+        </w:rPr>
+        <w:t xml:space="preserve"> in both groups</w:t>
+      </w:r>
+      <w:r>
+        <w:rPr>
+          <w:i w:val="0"/>
+          <w:iCs w:val="0"/>
+          <w:color w:val="auto"/>
+          <w:sz w:val="24"/>
+          <w:szCs w:val="24"/>
+        </w:rPr>
+        <w:t>.</w:t>
+      </w:r>
+      <w:r>
+        <w:rPr>
+          <w:i w:val="0"/>
+          <w:iCs w:val="0"/>
+          <w:color w:val="auto"/>
+          <w:sz w:val="24"/>
+          <w:szCs w:val="24"/>
+        </w:rPr>
+        <w:t xml:space="preserve"> No apparent differences in viral load are visible at both time points</w:t>
+      </w:r>
+      <w:r>
+        <w:rPr>
+          <w:i w:val="0"/>
+          <w:iCs w:val="0"/>
+          <w:color w:val="auto"/>
+          <w:sz w:val="24"/>
+          <w:szCs w:val="24"/>
+        </w:rPr>
+        <w:t>.</w:t>
+      </w:r>
+      <w:r>
+        <w:rPr>
+          <w:i w:val="0"/>
+          <w:iCs w:val="0"/>
+          <w:color w:val="auto"/>
+          <w:sz w:val="24"/>
+          <w:szCs w:val="24"/>
+        </w:rPr>
+        <w:t xml:space="preserve"> </w:t>
+      </w:r>
+      <w:r>
+        <w:rPr>
+          <w:i w:val="0"/>
+          <w:iCs w:val="0"/>
+          <w:color w:val="auto"/>
+          <w:sz w:val="24"/>
+          <w:szCs w:val="24"/>
+        </w:rPr>
+        <w:t>Physical and mental quality-of-life scores remained relatively stable over time</w:t>
+      </w:r>
+      <w:r>
+        <w:rPr>
+          <w:i w:val="0"/>
+          <w:iCs w:val="0"/>
+          <w:color w:val="auto"/>
+          <w:sz w:val="24"/>
+          <w:szCs w:val="24"/>
+        </w:rPr>
+        <w:t xml:space="preserve"> with drug users typically reporting lower QOL scores across both time points</w:t>
+      </w:r>
+      <w:r>
+        <w:rPr>
+          <w:i w:val="0"/>
+          <w:iCs w:val="0"/>
+          <w:color w:val="auto"/>
+          <w:sz w:val="24"/>
+          <w:szCs w:val="24"/>
+        </w:rPr>
+        <w:t>.</w:t>
       </w:r>
     </w:p>
     <w:p>
@@ -1286,9 +1455,9 @@
         </w:rPr>
         <w:lastRenderedPageBreak/>
         <w:drawing>
-          <wp:inline distT="0" distB="0" distL="0" distR="0" wp14:anchorId="262781E6" wp14:editId="643C5D8B">
-            <wp:extent cx="3578087" cy="2052843"/>
-            <wp:effectExtent l="0" t="0" r="3810" b="5080"/>
+          <wp:inline distT="0" distB="0" distL="0" distR="0" wp14:anchorId="262781E6" wp14:editId="4B965478">
+            <wp:extent cx="3323646" cy="1906863"/>
+            <wp:effectExtent l="0" t="0" r="3810" b="0"/>
             <wp:docPr id="1978726451" name="Picture 1" descr="A diagram of a triangle with numbers and formulas&#10;&#10;AI-generated content may be incorrect."/>
             <wp:cNvGraphicFramePr>
               <a:graphicFrameLocks xmlns:a="http://schemas.openxmlformats.org/drawingml/2006/main" noChangeAspect="1"/>
@@ -1309,7 +1478,7 @@
                   <pic:spPr>
                     <a:xfrm>
                       <a:off x="0" y="0"/>
-                      <a:ext cx="3605515" cy="2068579"/>
+                      <a:ext cx="3373410" cy="1935414"/>
                     </a:xfrm>
                     <a:prstGeom prst="rect">
                       <a:avLst/>
@@ -1428,7 +1597,25 @@
           <w:sz w:val="21"/>
           <w:szCs w:val="21"/>
         </w:rPr>
-        <w:t>reflects both the crude association between hard drug use and year-2 CD4 and the adjusted representation after accounting for adherence</w:t>
+        <w:t xml:space="preserve">reflects both the crude association between hard drug use and year-2 CD4 and the adjusted </w:t>
+      </w:r>
+      <w:r>
+        <w:rPr>
+          <w:i w:val="0"/>
+          <w:iCs w:val="0"/>
+          <w:sz w:val="21"/>
+          <w:szCs w:val="21"/>
+        </w:rPr>
+        <w:t>association</w:t>
+      </w:r>
+      <w:r>
+        <w:rPr>
+          <w:i w:val="0"/>
+          <w:iCs w:val="0"/>
+          <w:sz w:val="21"/>
+          <w:szCs w:val="21"/>
+        </w:rPr>
+        <w:t xml:space="preserve"> after accounting for adherence</w:t>
       </w:r>
       <w:r>
         <w:rPr>

</xml_diff>

<commit_message>
Performed some cleanup in wording in the data analysis plan. Also, noticed my graphs of CD4 were not on the log10 scale.
</commit_message>
<xml_diff>
--- a/Project1/Reports/Project1_Data_Analysis_Plan.docx
+++ b/Project1/Reports/Project1_Data_Analysis_Plan.docx
@@ -157,79 +157,6 @@
             </w:rPr>
             <w:fldChar w:fldCharType="separate"/>
           </w:r>
-        </w:p>
-        <w:p>
-          <w:pPr>
-            <w:pStyle w:val="TOC2"/>
-            <w:tabs>
-              <w:tab w:val="right" w:leader="dot" w:pos="9350"/>
-            </w:tabs>
-            <w:rPr>
-              <w:rFonts w:eastAsiaTheme="minorEastAsia"/>
-              <w:b w:val="0"/>
-              <w:bCs w:val="0"/>
-              <w:noProof/>
-              <w:sz w:val="24"/>
-              <w:szCs w:val="24"/>
-            </w:rPr>
-          </w:pPr>
-          <w:hyperlink w:anchor="_Toc222223984" w:history="1">
-            <w:r>
-              <w:rPr>
-                <w:rStyle w:val="Hyperlink"/>
-                <w:noProof/>
-              </w:rPr>
-              <w:t>Data Analysis Plan</w:t>
-            </w:r>
-            <w:r>
-              <w:rPr>
-                <w:noProof/>
-                <w:webHidden/>
-              </w:rPr>
-              <w:tab/>
-            </w:r>
-            <w:r>
-              <w:rPr>
-                <w:noProof/>
-                <w:webHidden/>
-              </w:rPr>
-              <w:fldChar w:fldCharType="begin"/>
-            </w:r>
-            <w:r>
-              <w:rPr>
-                <w:noProof/>
-                <w:webHidden/>
-              </w:rPr>
-              <w:instrText xml:space="preserve"> PAGEREF _Toc222223984 \h </w:instrText>
-            </w:r>
-            <w:r>
-              <w:rPr>
-                <w:noProof/>
-                <w:webHidden/>
-              </w:rPr>
-            </w:r>
-            <w:r>
-              <w:rPr>
-                <w:noProof/>
-                <w:webHidden/>
-              </w:rPr>
-              <w:fldChar w:fldCharType="separate"/>
-            </w:r>
-            <w:r>
-              <w:rPr>
-                <w:noProof/>
-                <w:webHidden/>
-              </w:rPr>
-              <w:t>1</w:t>
-            </w:r>
-            <w:r>
-              <w:rPr>
-                <w:noProof/>
-                <w:webHidden/>
-              </w:rPr>
-              <w:fldChar w:fldCharType="end"/>
-            </w:r>
-          </w:hyperlink>
         </w:p>
         <w:p>
           <w:pPr>
@@ -581,16 +508,7 @@
     </w:p>
     <w:p>
       <w:r>
-        <w:t xml:space="preserve">Treatment response in this study will be evaluated using four outcome measures assessed two years after HAART initiation. The first outcome is viral load defined as the number of HIV RNA copies per milliliter of blood. The second outcome is CD4+ T-cell count, a measure of immune function. Together, these laboratory measures provide objective indicators of </w:t>
-      </w:r>
-      <w:r>
-        <w:t>immunity</w:t>
-      </w:r>
-      <w:r>
-        <w:t xml:space="preserve"> suppression</w:t>
-      </w:r>
-      <w:r>
-        <w:t>.</w:t>
+        <w:t xml:space="preserve">Treatment response in this study will be evaluated using four outcome measures assessed two years after HAART initiation. The first outcome is viral load defined as the number of HIV RNA copies per milliliter of blood. The second outcome is CD4+ T-cell count, a measure of immune function. </w:t>
       </w:r>
     </w:p>
     <w:p>
@@ -699,104 +617,107 @@
         <w:t xml:space="preserve"> or NA values</w:t>
       </w:r>
       <w:r>
-        <w:t xml:space="preserve">. However, because these variables were not included in the primary models, this recoding did not affect the </w:t>
-      </w:r>
-      <w:r>
-        <w:t xml:space="preserve">primary </w:t>
-      </w:r>
-      <w:r>
-        <w:t>results.</w:t>
-      </w:r>
-    </w:p>
-    <w:p>
-      <w:r>
-        <w:t xml:space="preserve">Self-reported race/ethnicity </w:t>
-      </w:r>
-      <w:r>
-        <w:t>will be</w:t>
-      </w:r>
-      <w:r>
-        <w:t xml:space="preserve"> included as a covariate to account for potential confounding by </w:t>
-      </w:r>
-      <w:r>
-        <w:t>social drivers of health</w:t>
-      </w:r>
-      <w:r>
-        <w:t xml:space="preserve"> and healthcare access disparities.</w:t>
+        <w:t xml:space="preserve">. </w:t>
+      </w:r>
+    </w:p>
+    <w:p>
+      <w:r>
+        <w:t>The r</w:t>
+      </w:r>
+      <w:r>
+        <w:t xml:space="preserve">ace/ethnicity </w:t>
+      </w:r>
+      <w:r>
+        <w:t xml:space="preserve">covariate </w:t>
+      </w:r>
+      <w:r>
+        <w:t>will combine</w:t>
       </w:r>
       <w:r>
         <w:t xml:space="preserve"> </w:t>
       </w:r>
       <w:r>
-        <w:t xml:space="preserve">For analyses, we </w:t>
-      </w:r>
-      <w:r>
-        <w:t>will combine</w:t>
+        <w:t>White-Hispanic, Black-Hispanic, and Other-Hispanic as one category</w:t>
+      </w:r>
+      <w:r>
+        <w:t xml:space="preserve"> for Hispanic</w:t>
+      </w:r>
+      <w:r>
+        <w:t xml:space="preserve">. </w:t>
+      </w:r>
+      <w:r>
+        <w:t>We acknowledge that race is a social construct and that observed differences likely reflect structural inequities rather than biological differences.</w:t>
       </w:r>
       <w:r>
         <w:t xml:space="preserve"> </w:t>
       </w:r>
       <w:r>
-        <w:t>White-Hispanic, Black-Hispanic, and Other-Hispanic as one category</w:t>
-      </w:r>
-      <w:r>
-        <w:t xml:space="preserve"> for Hispanic</w:t>
+        <w:t xml:space="preserve">Additionally, we are not estimating race effects but purely </w:t>
+      </w:r>
+      <w:r>
+        <w:t>adjusting</w:t>
+      </w:r>
+      <w:r>
+        <w:t xml:space="preserve"> for confounding.</w:t>
+      </w:r>
+      <w:r>
+        <w:t xml:space="preserve"> </w:t>
+      </w:r>
+      <w:r>
+        <w:t>The education covariate was also</w:t>
+      </w:r>
+      <w:r>
+        <w:t xml:space="preserve"> collapsed into </w:t>
+      </w:r>
+      <w:r>
+        <w:t>High School or less</w:t>
+      </w:r>
+      <w:r>
+        <w:t xml:space="preserve">, </w:t>
+      </w:r>
+      <w:r>
+        <w:t>College, and Post-grad</w:t>
+      </w:r>
+      <w:r>
+        <w:t xml:space="preserve"> for simplicity</w:t>
+      </w:r>
+      <w:r>
+        <w:t>.</w:t>
+      </w:r>
+    </w:p>
+    <w:p>
+      <w:r>
+        <w:t>Viral load values were highly right-skewed</w:t>
+      </w:r>
+      <w:r>
+        <w:t xml:space="preserve"> and were </w:t>
+      </w:r>
+      <w:r>
+        <w:t xml:space="preserve">transformed using </w:t>
+      </w:r>
+      <w:r>
+        <w:t xml:space="preserve">logarithm with </w:t>
+      </w:r>
+      <w:r>
+        <w:t xml:space="preserve">base-10 </w:t>
+      </w:r>
+      <w:r>
+        <w:t>for</w:t>
+      </w:r>
+      <w:r>
+        <w:t xml:space="preserve"> modeling. CD4+ T-cell counts </w:t>
+      </w:r>
+      <w:r>
+        <w:t>on the original scale will be retained after examining</w:t>
+      </w:r>
+      <w:r>
+        <w:t xml:space="preserve"> distributional properties and residual diagnostics from preliminary regression models. Although the raw CD4 distribution was moderately right-skewed, residual diagnostics indicated acceptable normality and </w:t>
+      </w:r>
+      <w:r>
+        <w:t>consistent variance</w:t>
       </w:r>
       <w:r>
         <w:t xml:space="preserve">. </w:t>
-      </w:r>
-      <w:r>
-        <w:t>We acknowledge that race is a social construct and that observed differences likely reflect structural inequities rather than biological differences.</w:t>
-      </w:r>
-      <w:r>
-        <w:t xml:space="preserve"> </w:t>
-      </w:r>
-      <w:r>
-        <w:t xml:space="preserve">Additionally, we are not estimating race effects but purely </w:t>
-      </w:r>
-      <w:r>
-        <w:t>adjusting</w:t>
-      </w:r>
-      <w:r>
-        <w:t xml:space="preserve"> for confounding.</w:t>
-      </w:r>
-    </w:p>
-    <w:p>
-      <w:r>
-        <w:t>Viral load values were highly right-skewed</w:t>
-      </w:r>
-      <w:r>
-        <w:t xml:space="preserve"> and were </w:t>
-      </w:r>
-      <w:r>
-        <w:t xml:space="preserve">transformed using </w:t>
-      </w:r>
-      <w:r>
-        <w:t xml:space="preserve">logarithm with </w:t>
-      </w:r>
-      <w:r>
-        <w:t xml:space="preserve">base-10 </w:t>
-      </w:r>
-      <w:r>
-        <w:t>for</w:t>
-      </w:r>
-      <w:r>
-        <w:t xml:space="preserve"> modeling. CD4+ T-cell counts were examined for distributional properties using histograms and residual diagnostics from preliminary regression models. Although the raw CD4 distribution was moderately right-skewed, residual diagnostics indicated acceptable normality and </w:t>
-      </w:r>
-      <w:r>
-        <w:t>consistent variance</w:t>
-      </w:r>
-      <w:r>
-        <w:t xml:space="preserve">. Therefore, CD4 counts </w:t>
-      </w:r>
-      <w:r>
-        <w:t>will be</w:t>
-      </w:r>
-      <w:r>
-        <w:t xml:space="preserve"> retained on the original scale</w:t>
-      </w:r>
-      <w:r>
-        <w:t>.</w:t>
       </w:r>
     </w:p>
     <w:p>
@@ -852,7 +773,19 @@
         <w:t>.</w:t>
       </w:r>
       <w:r>
-        <w:t xml:space="preserve"> Both models adjusted for age, BMI, smoking status, education, race/ethnicity, and baseline disease severity.</w:t>
+        <w:t xml:space="preserve"> </w:t>
+      </w:r>
+      <w:r>
+        <w:t>All</w:t>
+      </w:r>
+      <w:r>
+        <w:t xml:space="preserve"> models </w:t>
+      </w:r>
+      <w:r>
+        <w:t xml:space="preserve">are </w:t>
+      </w:r>
+      <w:r>
+        <w:t>adjusted for age, BMI, smoking status, education, race/ethnicity, and baseline disease severity.</w:t>
       </w:r>
     </w:p>
     <w:p>
@@ -862,18 +795,54 @@
     </w:p>
     <w:p>
       <w:r>
-        <w:t xml:space="preserve">In addition to frequentist linear regression models, Bayesian regression models will also be fit for each outcome to allow comparison of inference under a Bayesian framework. The same model structure will be used in both frameworks. Under the Bayesian </w:t>
+        <w:t xml:space="preserve">In addition to frequentist linear regression models, Bayesian regression models will also be fit for each outcome to allow comparison of inference under a Bayesian framework. The same model structure will be used in both frameworks. </w:t>
+      </w:r>
+      <w:r>
+        <w:t>For</w:t>
+      </w:r>
+      <w:r>
+        <w:t xml:space="preserve"> Bayesian </w:t>
       </w:r>
       <w:r>
         <w:t xml:space="preserve">prior </w:t>
       </w:r>
       <w:r>
+        <w:t>specification</w:t>
+      </w:r>
+      <w:r>
+        <w:t>s</w:t>
+      </w:r>
+      <w:r>
+        <w:t xml:space="preserve">, </w:t>
+      </w:r>
+      <w:r>
+        <w:t>vague</w:t>
+      </w:r>
+      <w:r>
+        <w:t xml:space="preserve"> normal priors will be </w:t>
+      </w:r>
+      <w:r>
+        <w:t>used</w:t>
+      </w:r>
+      <w:r>
+        <w:t xml:space="preserve"> on regression coefficients, and a half-Cauchy prior will be </w:t>
+      </w:r>
+      <w:r>
+        <w:t>used</w:t>
+      </w:r>
+      <w:r>
+        <w:t xml:space="preserve"> on the residual standard deviation</w:t>
+      </w:r>
+      <w:r>
+        <w:t xml:space="preserve"> for initial modelling</w:t>
+      </w:r>
+      <w:r>
+        <w:t>.</w:t>
+      </w:r>
+    </w:p>
+    <w:p>
+      <w:r>
         <w:lastRenderedPageBreak/>
-        <w:t>specification, weakly informative normal priors will be placed on regression coefficients, and a half-Cauchy prior will be placed on the residual standard deviation.</w:t>
-      </w:r>
-    </w:p>
-    <w:p>
-      <w:r>
         <w:t>Mediation</w:t>
       </w:r>
       <w:r>
@@ -907,7 +876,22 @@
         <w:t xml:space="preserve"> </w:t>
       </w:r>
       <w:r>
-        <w:t>Bayesian mediation models were specified using joint regression of adherence and Year 2 outcomes. Indirect effects were computed as the posterior distribution of the product of the exposure–mediator and mediator–outcome regression coefficients. Highest density intervals were used to assess evidence of mediation.</w:t>
+        <w:t xml:space="preserve">Bayesian mediation models </w:t>
+      </w:r>
+      <w:r>
+        <w:t xml:space="preserve">will also be used for comparisons. </w:t>
+      </w:r>
+      <w:r>
+        <w:t xml:space="preserve">Highest density intervals </w:t>
+      </w:r>
+      <w:r>
+        <w:t xml:space="preserve">(HDIs) </w:t>
+      </w:r>
+      <w:r>
+        <w:t>will be</w:t>
+      </w:r>
+      <w:r>
+        <w:t xml:space="preserve"> used to assess evidence of mediation.</w:t>
       </w:r>
     </w:p>
     <w:p>
@@ -935,7 +919,7 @@
         <w:t xml:space="preserve"> will be used to assess significance</w:t>
       </w:r>
       <w:r>
-        <w:t>. Posterior means and 95% highest density intervals (HDIs) will be reported for each parameter estimate. Convergence of each Bayesian model will be assessed using trace plots and the Gelman–Rubin statistic (R̂).</w:t>
+        <w:t>. Posterior means and 95% HDIs will be reported for each parameter estimate. Convergence of each Bayesian model will be assessed using trace plots and the Gelman–Rubin statistic (R̂).</w:t>
       </w:r>
     </w:p>
     <w:p>
@@ -1157,13 +1141,38 @@
       </w:pPr>
       <w:r>
         <w:lastRenderedPageBreak/>
-        <w:t xml:space="preserve">Baseline characteristics of the study cohort are presented in Table 1. At HAART initiation, </w:t>
+        <w:t xml:space="preserve">Baseline characteristics of the study cohort </w:t>
+      </w:r>
+      <w:r>
+        <w:t xml:space="preserve">at HARRT initiation </w:t>
+      </w:r>
+      <w:r>
+        <w:t xml:space="preserve">are presented in </w:t>
+      </w:r>
+      <w:r>
+        <w:rPr>
+          <w:b/>
+          <w:bCs/>
+        </w:rPr>
+        <w:t>Table 1</w:t>
+      </w:r>
+      <w:r>
+        <w:t xml:space="preserve">, </w:t>
+      </w:r>
+      <w:r>
+        <w:t xml:space="preserve">which shows that </w:t>
       </w:r>
       <w:r>
         <w:t>9.2</w:t>
       </w:r>
       <w:r>
-        <w:t xml:space="preserve">% of participants reported hard drug use. Drug users were </w:t>
+        <w:t>% of participants reported hard drug use</w:t>
+      </w:r>
+      <w:r>
+        <w:t xml:space="preserve"> at initiation</w:t>
+      </w:r>
+      <w:r>
+        <w:t xml:space="preserve">. Drug users were </w:t>
       </w:r>
       <w:r>
         <w:t>typically more depressed</w:t>
@@ -1204,10 +1213,10 @@
           <w:color w:val="000000" w:themeColor="text1"/>
         </w:rPr>
         <w:drawing>
-          <wp:inline distT="0" distB="0" distL="0" distR="0" wp14:anchorId="14125951" wp14:editId="3B96D431">
-            <wp:extent cx="4920609" cy="3371353"/>
-            <wp:effectExtent l="0" t="0" r="0" b="0"/>
-            <wp:docPr id="227822229" name="Picture 1" descr="A graph of different colored boxes&#10;&#10;AI-generated content may be incorrect."/>
+          <wp:inline distT="0" distB="0" distL="0" distR="0" wp14:anchorId="1F98B489" wp14:editId="699D94B2">
+            <wp:extent cx="5445358" cy="3347499"/>
+            <wp:effectExtent l="0" t="0" r="3175" b="5715"/>
+            <wp:docPr id="594901995" name="Picture 1" descr="A graph of different colored boxes&#10;&#10;AI-generated content may be incorrect."/>
             <wp:cNvGraphicFramePr>
               <a:graphicFrameLocks xmlns:a="http://schemas.openxmlformats.org/drawingml/2006/main" noChangeAspect="1"/>
             </wp:cNvGraphicFramePr>
@@ -1215,7 +1224,7 @@
               <a:graphicData uri="http://schemas.openxmlformats.org/drawingml/2006/picture">
                 <pic:pic xmlns:pic="http://schemas.openxmlformats.org/drawingml/2006/picture">
                   <pic:nvPicPr>
-                    <pic:cNvPr id="227822229" name="Picture 1" descr="A graph of different colored boxes&#10;&#10;AI-generated content may be incorrect."/>
+                    <pic:cNvPr id="594901995" name="Picture 1" descr="A graph of different colored boxes&#10;&#10;AI-generated content may be incorrect."/>
                     <pic:cNvPicPr/>
                   </pic:nvPicPr>
                   <pic:blipFill>
@@ -1227,7 +1236,7 @@
                   <pic:spPr>
                     <a:xfrm>
                       <a:off x="0" y="0"/>
-                      <a:ext cx="4940246" cy="3384807"/>
+                      <a:ext cx="5467637" cy="3361195"/>
                     </a:xfrm>
                     <a:prstGeom prst="rect">
                       <a:avLst/>
@@ -1271,7 +1280,21 @@
           <w:sz w:val="21"/>
           <w:szCs w:val="21"/>
         </w:rPr>
-        <w:t xml:space="preserve">. Distribution of treatment response measures at baseline (Year 0) and Year 2 following HAART initiation, stratified by baseline hard drug use. Boxplots display the median and interquartile range, with points representing individual observations. </w:t>
+        <w:t>. Distribution of treatment response measures at baseline (Year 0) and Year 2 following HAART initiation, stratified by baseline hard drug use. Boxplots display the median</w:t>
+      </w:r>
+      <w:r>
+        <w:rPr>
+          <w:sz w:val="21"/>
+          <w:szCs w:val="21"/>
+        </w:rPr>
+        <w:t xml:space="preserve"> (black line)</w:t>
+      </w:r>
+      <w:r>
+        <w:rPr>
+          <w:sz w:val="21"/>
+          <w:szCs w:val="21"/>
+        </w:rPr>
+        <w:t xml:space="preserve"> and interquartile range, with points representing individual observations. </w:t>
       </w:r>
     </w:p>
     <w:p>
@@ -1343,7 +1366,27 @@
           <w:sz w:val="24"/>
           <w:szCs w:val="24"/>
         </w:rPr>
-        <w:t>Viral load (log copies/mL) declined substantially following treatment initiation</w:t>
+        <w:t>Viral load (log</w:t>
+      </w:r>
+      <w:r>
+        <w:rPr>
+          <w:i w:val="0"/>
+          <w:iCs w:val="0"/>
+          <w:color w:val="auto"/>
+          <w:sz w:val="24"/>
+          <w:szCs w:val="24"/>
+        </w:rPr>
+        <w:t xml:space="preserve">10 </w:t>
+      </w:r>
+      <w:r>
+        <w:rPr>
+          <w:i w:val="0"/>
+          <w:iCs w:val="0"/>
+          <w:color w:val="auto"/>
+          <w:sz w:val="24"/>
+          <w:szCs w:val="24"/>
+        </w:rPr>
+        <w:t>copies/mL) declined substantially following treatment initiation</w:t>
       </w:r>
       <w:r>
         <w:rPr>
@@ -1567,10 +1610,91 @@
         <w:rPr>
           <w:i w:val="0"/>
           <w:iCs w:val="0"/>
-          <w:sz w:val="21"/>
-          <w:szCs w:val="21"/>
+          <w:color w:val="auto"/>
+          <w:sz w:val="24"/>
+          <w:szCs w:val="24"/>
         </w:rPr>
         <w:t xml:space="preserve">Baseline hard drug use (X) is hypothesized to influence Year-2 CD4 count (Y) both directly and indirectly through adherence to HAART (M). The arrow from X to M represents the association between hard drug use and adherence, while the arrow from M to Y represents the association between adherence and </w:t>
+      </w:r>
+      <w:r>
+        <w:rPr>
+          <w:i w:val="0"/>
+          <w:iCs w:val="0"/>
+          <w:color w:val="auto"/>
+          <w:sz w:val="24"/>
+          <w:szCs w:val="24"/>
+        </w:rPr>
+        <w:t>CD4+ T cell counts</w:t>
+      </w:r>
+      <w:r>
+        <w:rPr>
+          <w:i w:val="0"/>
+          <w:iCs w:val="0"/>
+          <w:color w:val="auto"/>
+          <w:sz w:val="24"/>
+          <w:szCs w:val="24"/>
+        </w:rPr>
+        <w:t xml:space="preserve">. The direct path from X to Y </w:t>
+      </w:r>
+      <w:r>
+        <w:rPr>
+          <w:i w:val="0"/>
+          <w:iCs w:val="0"/>
+          <w:color w:val="auto"/>
+          <w:sz w:val="24"/>
+          <w:szCs w:val="24"/>
+        </w:rPr>
+        <w:t xml:space="preserve">reflects both the crude association between hard drug use and year-2 CD4 and the adjusted </w:t>
+      </w:r>
+      <w:r>
+        <w:rPr>
+          <w:i w:val="0"/>
+          <w:iCs w:val="0"/>
+          <w:color w:val="auto"/>
+          <w:sz w:val="24"/>
+          <w:szCs w:val="24"/>
+        </w:rPr>
+        <w:t>association</w:t>
+      </w:r>
+      <w:r>
+        <w:rPr>
+          <w:i w:val="0"/>
+          <w:iCs w:val="0"/>
+          <w:color w:val="auto"/>
+          <w:sz w:val="24"/>
+          <w:szCs w:val="24"/>
+        </w:rPr>
+        <w:t xml:space="preserve"> after accounting for adherence</w:t>
+      </w:r>
+      <w:r>
+        <w:rPr>
+          <w:i w:val="0"/>
+          <w:iCs w:val="0"/>
+          <w:color w:val="auto"/>
+          <w:sz w:val="24"/>
+          <w:szCs w:val="24"/>
+        </w:rPr>
+        <w:t>. Covariates are omitted from this preliminary diagram for clarity but are included in adjusted analyses.</w:t>
+      </w:r>
+      <w:r>
+        <w:rPr>
+          <w:i w:val="0"/>
+          <w:iCs w:val="0"/>
+          <w:color w:val="auto"/>
+          <w:sz w:val="24"/>
+          <w:szCs w:val="24"/>
+        </w:rPr>
+        <w:t xml:space="preserve"> Initial results, show that the percent being mediated by adherence is minimal</w:t>
+      </w:r>
+      <w:r>
+        <w:rPr>
+          <w:i w:val="0"/>
+          <w:iCs w:val="0"/>
+          <w:color w:val="auto"/>
+          <w:sz w:val="24"/>
+          <w:szCs w:val="24"/>
+        </w:rPr>
+        <w:t xml:space="preserve"> at approximately 4.4%</w:t>
       </w:r>
       <w:r>
         <w:rPr>
@@ -1579,86 +1703,14 @@
           <w:sz w:val="21"/>
           <w:szCs w:val="21"/>
         </w:rPr>
-        <w:t>CD4+ T cell counts</w:t>
+        <w:t xml:space="preserve"> </w:t>
       </w:r>
       <w:r>
         <w:rPr>
           <w:i w:val="0"/>
           <w:iCs w:val="0"/>
-          <w:sz w:val="21"/>
-          <w:szCs w:val="21"/>
-        </w:rPr>
-        <w:t xml:space="preserve">. The direct path from X to Y </w:t>
-      </w:r>
-      <w:r>
-        <w:rPr>
-          <w:i w:val="0"/>
-          <w:iCs w:val="0"/>
-          <w:sz w:val="21"/>
-          <w:szCs w:val="21"/>
-        </w:rPr>
-        <w:t xml:space="preserve">reflects both the crude association between hard drug use and year-2 CD4 and the adjusted </w:t>
-      </w:r>
-      <w:r>
-        <w:rPr>
-          <w:i w:val="0"/>
-          <w:iCs w:val="0"/>
-          <w:sz w:val="21"/>
-          <w:szCs w:val="21"/>
-        </w:rPr>
-        <w:t>association</w:t>
-      </w:r>
-      <w:r>
-        <w:rPr>
-          <w:i w:val="0"/>
-          <w:iCs w:val="0"/>
-          <w:sz w:val="21"/>
-          <w:szCs w:val="21"/>
-        </w:rPr>
-        <w:t xml:space="preserve"> after accounting for adherence</w:t>
-      </w:r>
-      <w:r>
-        <w:rPr>
-          <w:i w:val="0"/>
-          <w:iCs w:val="0"/>
-          <w:sz w:val="21"/>
-          <w:szCs w:val="21"/>
-        </w:rPr>
-        <w:t>. Covariates are omitted from this preliminary diagram for clarity but are included in adjusted analyses.</w:t>
-      </w:r>
-      <w:r>
-        <w:rPr>
-          <w:i w:val="0"/>
-          <w:iCs w:val="0"/>
-          <w:sz w:val="21"/>
-          <w:szCs w:val="21"/>
-        </w:rPr>
-        <w:t xml:space="preserve"> Initial results, show that the percent being mediated by adherence is minimal</w:t>
-      </w:r>
-      <w:r>
-        <w:rPr>
-          <w:i w:val="0"/>
-          <w:iCs w:val="0"/>
-          <w:sz w:val="21"/>
-          <w:szCs w:val="21"/>
-        </w:rPr>
-        <w:t xml:space="preserve"> at approximately 4.4%</w:t>
-      </w:r>
-      <w:r>
-        <w:rPr>
-          <w:i w:val="0"/>
-          <w:iCs w:val="0"/>
-          <w:sz w:val="21"/>
-          <w:szCs w:val="21"/>
-        </w:rPr>
-        <w:t xml:space="preserve"> </w:t>
-      </w:r>
-      <w:r>
-        <w:rPr>
-          <w:i w:val="0"/>
-          <w:iCs w:val="0"/>
-          <w:sz w:val="21"/>
-          <w:szCs w:val="21"/>
+          <w:sz w:val="24"/>
+          <w:szCs w:val="24"/>
         </w:rPr>
         <w:t>[</w:t>
       </w:r>
@@ -1669,8 +1721,8 @@
               <w:rPr>
                 <w:rFonts w:ascii="Cambria Math" w:hAnsi="Cambria Math"/>
                 <w:iCs w:val="0"/>
-                <w:sz w:val="21"/>
-                <w:szCs w:val="21"/>
+                <w:sz w:val="24"/>
+                <w:szCs w:val="24"/>
               </w:rPr>
             </m:ctrlPr>
           </m:fPr>
@@ -1681,8 +1733,8 @@
                   <w:rPr>
                     <w:rFonts w:ascii="Cambria Math" w:hAnsi="Cambria Math"/>
                     <w:iCs w:val="0"/>
-                    <w:sz w:val="21"/>
-                    <w:szCs w:val="21"/>
+                    <w:sz w:val="24"/>
+                    <w:szCs w:val="24"/>
                   </w:rPr>
                 </m:ctrlPr>
               </m:accPr>
@@ -1693,8 +1745,8 @@
                       <w:rPr>
                         <w:rFonts w:ascii="Cambria Math" w:hAnsi="Cambria Math"/>
                         <w:iCs w:val="0"/>
-                        <w:sz w:val="21"/>
-                        <w:szCs w:val="21"/>
+                        <w:sz w:val="24"/>
+                        <w:szCs w:val="24"/>
                       </w:rPr>
                     </m:ctrlPr>
                   </m:sSubPr>
@@ -1702,8 +1754,8 @@
                     <m:r>
                       <w:rPr>
                         <w:rFonts w:ascii="Cambria Math" w:hAnsi="Cambria Math"/>
-                        <w:sz w:val="21"/>
-                        <w:szCs w:val="21"/>
+                        <w:sz w:val="24"/>
+                        <w:szCs w:val="24"/>
                       </w:rPr>
                       <m:t>β</m:t>
                     </m:r>
@@ -1712,8 +1764,8 @@
                     <m:r>
                       <w:rPr>
                         <w:rFonts w:ascii="Cambria Math" w:hAnsi="Cambria Math"/>
-                        <w:sz w:val="21"/>
-                        <w:szCs w:val="21"/>
+                        <w:sz w:val="24"/>
+                        <w:szCs w:val="24"/>
                       </w:rPr>
                       <m:t>crude</m:t>
                     </m:r>
@@ -1724,8 +1776,8 @@
             <m:r>
               <w:rPr>
                 <w:rFonts w:ascii="Cambria Math" w:hAnsi="Cambria Math"/>
-                <w:sz w:val="21"/>
-                <w:szCs w:val="21"/>
+                <w:sz w:val="24"/>
+                <w:szCs w:val="24"/>
               </w:rPr>
               <m:t xml:space="preserve">- </m:t>
             </m:r>
@@ -1735,8 +1787,8 @@
                   <w:rPr>
                     <w:rFonts w:ascii="Cambria Math" w:hAnsi="Cambria Math"/>
                     <w:iCs w:val="0"/>
-                    <w:sz w:val="21"/>
-                    <w:szCs w:val="21"/>
+                    <w:sz w:val="24"/>
+                    <w:szCs w:val="24"/>
                   </w:rPr>
                 </m:ctrlPr>
               </m:accPr>
@@ -1747,8 +1799,8 @@
                       <w:rPr>
                         <w:rFonts w:ascii="Cambria Math" w:hAnsi="Cambria Math"/>
                         <w:iCs w:val="0"/>
-                        <w:sz w:val="21"/>
-                        <w:szCs w:val="21"/>
+                        <w:sz w:val="24"/>
+                        <w:szCs w:val="24"/>
                       </w:rPr>
                     </m:ctrlPr>
                   </m:sSubPr>
@@ -1756,8 +1808,8 @@
                     <m:r>
                       <w:rPr>
                         <w:rFonts w:ascii="Cambria Math" w:hAnsi="Cambria Math"/>
-                        <w:sz w:val="21"/>
-                        <w:szCs w:val="21"/>
+                        <w:sz w:val="24"/>
+                        <w:szCs w:val="24"/>
                       </w:rPr>
                       <m:t>β</m:t>
                     </m:r>
@@ -1766,8 +1818,8 @@
                     <m:r>
                       <w:rPr>
                         <w:rFonts w:ascii="Cambria Math" w:hAnsi="Cambria Math"/>
-                        <w:sz w:val="21"/>
-                        <w:szCs w:val="21"/>
+                        <w:sz w:val="24"/>
+                        <w:szCs w:val="24"/>
                       </w:rPr>
                       <m:t>adj</m:t>
                     </m:r>
@@ -1783,8 +1835,8 @@
                   <w:rPr>
                     <w:rFonts w:ascii="Cambria Math" w:hAnsi="Cambria Math"/>
                     <w:iCs w:val="0"/>
-                    <w:sz w:val="21"/>
-                    <w:szCs w:val="21"/>
+                    <w:sz w:val="24"/>
+                    <w:szCs w:val="24"/>
                   </w:rPr>
                 </m:ctrlPr>
               </m:accPr>
@@ -1795,8 +1847,8 @@
                       <w:rPr>
                         <w:rFonts w:ascii="Cambria Math" w:hAnsi="Cambria Math"/>
                         <w:iCs w:val="0"/>
-                        <w:sz w:val="21"/>
-                        <w:szCs w:val="21"/>
+                        <w:sz w:val="24"/>
+                        <w:szCs w:val="24"/>
                       </w:rPr>
                     </m:ctrlPr>
                   </m:sSubPr>
@@ -1804,8 +1856,8 @@
                     <m:r>
                       <w:rPr>
                         <w:rFonts w:ascii="Cambria Math" w:hAnsi="Cambria Math"/>
-                        <w:sz w:val="21"/>
-                        <w:szCs w:val="21"/>
+                        <w:sz w:val="24"/>
+                        <w:szCs w:val="24"/>
                       </w:rPr>
                       <m:t>β</m:t>
                     </m:r>
@@ -1814,8 +1866,8 @@
                     <m:r>
                       <w:rPr>
                         <w:rFonts w:ascii="Cambria Math" w:hAnsi="Cambria Math"/>
-                        <w:sz w:val="21"/>
-                        <w:szCs w:val="21"/>
+                        <w:sz w:val="24"/>
+                        <w:szCs w:val="24"/>
                       </w:rPr>
                       <m:t>crude</m:t>
                     </m:r>
@@ -1831,8 +1883,8 @@
           <w:rFonts w:eastAsiaTheme="minorEastAsia"/>
           <w:i w:val="0"/>
           <w:iCs w:val="0"/>
-          <w:sz w:val="21"/>
-          <w:szCs w:val="21"/>
+          <w:sz w:val="24"/>
+          <w:szCs w:val="24"/>
         </w:rPr>
         <w:t>].</w:t>
       </w:r>

</xml_diff>

<commit_message>
updated function script to include calculation of WAIC and LOO. Made progress on final report and tidied up sections in my code that were redundant or not needed.:
</commit_message>
<xml_diff>
--- a/Project1/Reports/Project1_Data_Analysis_Plan.docx
+++ b/Project1/Reports/Project1_Data_Analysis_Plan.docx
@@ -112,6 +112,16 @@
     </w:p>
     <w:sdt>
       <w:sdtPr>
+        <w:rPr>
+          <w:rFonts w:asciiTheme="minorHAnsi" w:eastAsiaTheme="minorHAnsi" w:hAnsiTheme="minorHAnsi" w:cstheme="minorBidi"/>
+          <w:b w:val="0"/>
+          <w:bCs w:val="0"/>
+          <w:color w:val="auto"/>
+          <w:kern w:val="2"/>
+          <w:sz w:val="24"/>
+          <w:szCs w:val="24"/>
+          <w14:ligatures w14:val="standardContextual"/>
+        </w:rPr>
         <w:id w:val="1857219255"/>
         <w:docPartObj>
           <w:docPartGallery w:val="Table of Contents"/>
@@ -120,13 +130,7 @@
       </w:sdtPr>
       <w:sdtEndPr>
         <w:rPr>
-          <w:rFonts w:asciiTheme="minorHAnsi" w:eastAsiaTheme="minorHAnsi" w:hAnsiTheme="minorHAnsi" w:cstheme="minorBidi"/>
           <w:noProof/>
-          <w:color w:val="auto"/>
-          <w:kern w:val="2"/>
-          <w:sz w:val="24"/>
-          <w:szCs w:val="24"/>
-          <w14:ligatures w14:val="standardContextual"/>
         </w:rPr>
       </w:sdtEndPr>
       <w:sdtContent>
@@ -670,10 +674,7 @@
         <w:t xml:space="preserve"> collapsed into </w:t>
       </w:r>
       <w:r>
-        <w:t>High School or less</w:t>
-      </w:r>
-      <w:r>
-        <w:t xml:space="preserve">, </w:t>
+        <w:t xml:space="preserve">High School or less, </w:t>
       </w:r>
       <w:r>
         <w:t>College, and Post-grad</w:t>
@@ -711,7 +712,13 @@
         <w:t>on the original scale will be retained after examining</w:t>
       </w:r>
       <w:r>
-        <w:t xml:space="preserve"> distributional properties and residual diagnostics from preliminary regression models. Although the raw CD4 distribution was moderately right-skewed, residual diagnostics indicated acceptable normality and </w:t>
+        <w:t xml:space="preserve"> distributional properties and residual diagnostics from preliminary regression models. Although the raw CD4 distribution was moderately right-skewed, </w:t>
+      </w:r>
+      <w:r>
+        <w:t xml:space="preserve">preliminary </w:t>
+      </w:r>
+      <w:r>
+        <w:t xml:space="preserve">residual diagnostics indicated acceptable normality and </w:t>
       </w:r>
       <w:r>
         <w:t>consistent variance</w:t>
@@ -1002,6 +1009,9 @@
         <w:jc w:val="center"/>
       </w:pPr>
       <w:r>
+        <w:rPr>
+          <w:noProof/>
+        </w:rPr>
         <w:drawing>
           <wp:inline distT="0" distB="0" distL="0" distR="0" wp14:anchorId="76D847AF" wp14:editId="1B596245">
             <wp:extent cx="4675603" cy="7370859"/>
@@ -1210,6 +1220,7 @@
       </w:pPr>
       <w:r>
         <w:rPr>
+          <w:noProof/>
           <w:color w:val="000000" w:themeColor="text1"/>
         </w:rPr>
         <w:drawing>
@@ -1346,7 +1357,7 @@
           <w:sz w:val="24"/>
           <w:szCs w:val="24"/>
         </w:rPr>
-        <w:t xml:space="preserve"> but with more variability at year 2</w:t>
+        <w:t xml:space="preserve"> but with more variability at year 2. </w:t>
       </w:r>
       <w:r>
         <w:rPr>
@@ -1356,7 +1367,7 @@
           <w:sz w:val="24"/>
           <w:szCs w:val="24"/>
         </w:rPr>
-        <w:t xml:space="preserve">. </w:t>
+        <w:t>Viral load (log</w:t>
       </w:r>
       <w:r>
         <w:rPr>
@@ -1366,7 +1377,7 @@
           <w:sz w:val="24"/>
           <w:szCs w:val="24"/>
         </w:rPr>
-        <w:t>Viral load (log</w:t>
+        <w:t xml:space="preserve">10 </w:t>
       </w:r>
       <w:r>
         <w:rPr>
@@ -1376,7 +1387,7 @@
           <w:sz w:val="24"/>
           <w:szCs w:val="24"/>
         </w:rPr>
-        <w:t xml:space="preserve">10 </w:t>
+        <w:t>copies/mL) declined substantially following treatment initiation</w:t>
       </w:r>
       <w:r>
         <w:rPr>
@@ -1386,7 +1397,7 @@
           <w:sz w:val="24"/>
           <w:szCs w:val="24"/>
         </w:rPr>
-        <w:t>copies/mL) declined substantially following treatment initiation</w:t>
+        <w:t xml:space="preserve"> in both groups</w:t>
       </w:r>
       <w:r>
         <w:rPr>
@@ -1396,7 +1407,7 @@
           <w:sz w:val="24"/>
           <w:szCs w:val="24"/>
         </w:rPr>
-        <w:t xml:space="preserve"> in both groups</w:t>
+        <w:t>.</w:t>
       </w:r>
       <w:r>
         <w:rPr>
@@ -1406,7 +1417,7 @@
           <w:sz w:val="24"/>
           <w:szCs w:val="24"/>
         </w:rPr>
-        <w:t>.</w:t>
+        <w:t xml:space="preserve"> No apparent differences in viral load are visible at both time points</w:t>
       </w:r>
       <w:r>
         <w:rPr>
@@ -1416,7 +1427,7 @@
           <w:sz w:val="24"/>
           <w:szCs w:val="24"/>
         </w:rPr>
-        <w:t xml:space="preserve"> No apparent differences in viral load are visible at both time points</w:t>
+        <w:t>.</w:t>
       </w:r>
       <w:r>
         <w:rPr>
@@ -1426,7 +1437,7 @@
           <w:sz w:val="24"/>
           <w:szCs w:val="24"/>
         </w:rPr>
-        <w:t>.</w:t>
+        <w:t xml:space="preserve"> </w:t>
       </w:r>
       <w:r>
         <w:rPr>
@@ -1436,7 +1447,7 @@
           <w:sz w:val="24"/>
           <w:szCs w:val="24"/>
         </w:rPr>
-        <w:t xml:space="preserve"> </w:t>
+        <w:t>Physical and mental quality-of-life scores remained relatively stable over time</w:t>
       </w:r>
       <w:r>
         <w:rPr>
@@ -1446,7 +1457,7 @@
           <w:sz w:val="24"/>
           <w:szCs w:val="24"/>
         </w:rPr>
-        <w:t>Physical and mental quality-of-life scores remained relatively stable over time</w:t>
+        <w:t xml:space="preserve"> with drug users typically reporting lower QOL scores across both time points</w:t>
       </w:r>
       <w:r>
         <w:rPr>
@@ -1456,16 +1467,6 @@
           <w:sz w:val="24"/>
           <w:szCs w:val="24"/>
         </w:rPr>
-        <w:t xml:space="preserve"> with drug users typically reporting lower QOL scores across both time points</w:t>
-      </w:r>
-      <w:r>
-        <w:rPr>
-          <w:i w:val="0"/>
-          <w:iCs w:val="0"/>
-          <w:color w:val="auto"/>
-          <w:sz w:val="24"/>
-          <w:szCs w:val="24"/>
-        </w:rPr>
         <w:t>.</w:t>
       </w:r>
     </w:p>
@@ -1494,6 +1495,7 @@
       </w:pPr>
       <w:r>
         <w:rPr>
+          <w:noProof/>
           <w:color w:val="000000" w:themeColor="text1"/>
         </w:rPr>
         <w:lastRenderedPageBreak/>
@@ -2993,6 +2995,7 @@
   <w:style w:type="character" w:default="1" w:styleId="DefaultParagraphFont">
     <w:name w:val="Default Paragraph Font"/>
     <w:uiPriority w:val="1"/>
+    <w:semiHidden/>
     <w:unhideWhenUsed/>
   </w:style>
   <w:style w:type="table" w:default="1" w:styleId="TableNormal">

</xml_diff>